<commit_message>
Translate execution cycle from linear memory to dynamic, separate logic and native address
</commit_message>
<xml_diff>
--- a/Documentation/MSLObjectsStructureRU.docx
+++ b/Documentation/MSLObjectsStructureRU.docx
@@ -8519,7 +8519,7 @@
                 <w:rFonts w:ascii="Bahnschrift" w:hAnsi="Bahnschrift"/>
                 <w:lang w:val="en-US" w:eastAsia="ru-RU"/>
               </w:rPr>
-              <w:t>code_offset</w:t>
+              <w:t>rod_size</w:t>
             </w:r>
             <w:proofErr w:type="spellEnd"/>
           </w:p>
@@ -8542,7 +8542,35 @@
                 <w:rFonts w:ascii="Bahnschrift" w:hAnsi="Bahnschrift"/>
                 <w:lang w:eastAsia="ru-RU"/>
               </w:rPr>
-              <w:t xml:space="preserve">Смещение команд </w:t>
+              <w:t xml:space="preserve">Размер </w:t>
+            </w:r>
+            <w:r>
+              <w:rPr>
+                <w:rFonts w:ascii="Bahnschrift" w:hAnsi="Bahnschrift"/>
+                <w:lang w:val="en-US" w:eastAsia="ru-RU"/>
+              </w:rPr>
+              <w:t>ROD</w:t>
+            </w:r>
+            <w:r>
+              <w:rPr>
+                <w:rFonts w:ascii="Bahnschrift" w:hAnsi="Bahnschrift"/>
+                <w:lang w:eastAsia="ru-RU"/>
+              </w:rPr>
+              <w:t xml:space="preserve"> секции. Данный параметр выровнен по 8, чтобы в </w:t>
+            </w:r>
+            <w:r>
+              <w:rPr>
+                <w:rFonts w:ascii="Bahnschrift" w:hAnsi="Bahnschrift"/>
+                <w:lang w:val="en-US" w:eastAsia="ru-RU"/>
+              </w:rPr>
+              <w:t>VM</w:t>
+            </w:r>
+            <w:r>
+              <w:rPr>
+                <w:rFonts w:ascii="Bahnschrift" w:hAnsi="Bahnschrift"/>
+                <w:lang w:eastAsia="ru-RU"/>
+              </w:rPr>
+              <w:t xml:space="preserve"> стек с кучей были также выровнены.</w:t>
             </w:r>
           </w:p>
         </w:tc>
@@ -8642,7 +8670,7 @@
               <w:jc w:val="center"/>
               <w:rPr>
                 <w:rFonts w:ascii="Bahnschrift" w:hAnsi="Bahnschrift"/>
-                <w:lang w:eastAsia="ru-RU"/>
+                <w:lang w:val="en-US" w:eastAsia="ru-RU"/>
               </w:rPr>
             </w:pPr>
             <w:proofErr w:type="spellStart"/>
@@ -8651,7 +8679,7 @@
                 <w:rFonts w:ascii="Bahnschrift" w:hAnsi="Bahnschrift"/>
                 <w:lang w:val="en-US" w:eastAsia="ru-RU"/>
               </w:rPr>
-              <w:t>code_size</w:t>
+              <w:t>code_offset</w:t>
             </w:r>
             <w:proofErr w:type="spellEnd"/>
           </w:p>
@@ -8674,7 +8702,7 @@
                 <w:rFonts w:ascii="Bahnschrift" w:hAnsi="Bahnschrift"/>
                 <w:lang w:eastAsia="ru-RU"/>
               </w:rPr>
-              <w:t>Размер команд в байтах</w:t>
+              <w:t xml:space="preserve">Смещение команд </w:t>
             </w:r>
           </w:p>
         </w:tc>
@@ -8691,6 +8719,13 @@
                 <w:lang w:eastAsia="ru-RU"/>
               </w:rPr>
             </w:pPr>
+            <w:r>
+              <w:rPr>
+                <w:rFonts w:ascii="Bahnschrift" w:hAnsi="Bahnschrift"/>
+                <w:lang w:eastAsia="ru-RU"/>
+              </w:rPr>
+              <w:t>-</w:t>
+            </w:r>
           </w:p>
         </w:tc>
         <w:tc>
@@ -8767,16 +8802,18 @@
               <w:jc w:val="center"/>
               <w:rPr>
                 <w:rFonts w:ascii="Bahnschrift" w:hAnsi="Bahnschrift"/>
-                <w:lang w:val="en-US" w:eastAsia="ru-RU"/>
-              </w:rPr>
-            </w:pPr>
-            <w:r>
-              <w:rPr>
-                <w:rFonts w:ascii="Bahnschrift" w:hAnsi="Bahnschrift"/>
-                <w:lang w:val="en-US" w:eastAsia="ru-RU"/>
-              </w:rPr>
-              <w:t>rod</w:t>
-            </w:r>
+                <w:lang w:eastAsia="ru-RU"/>
+              </w:rPr>
+            </w:pPr>
+            <w:proofErr w:type="spellStart"/>
+            <w:r>
+              <w:rPr>
+                <w:rFonts w:ascii="Bahnschrift" w:hAnsi="Bahnschrift"/>
+                <w:lang w:val="en-US" w:eastAsia="ru-RU"/>
+              </w:rPr>
+              <w:t>code_size</w:t>
+            </w:r>
+            <w:proofErr w:type="spellEnd"/>
           </w:p>
         </w:tc>
         <w:tc>
@@ -8797,7 +8834,7 @@
                 <w:rFonts w:ascii="Bahnschrift" w:hAnsi="Bahnschrift"/>
                 <w:lang w:eastAsia="ru-RU"/>
               </w:rPr>
-              <w:t>Данные только для чтения</w:t>
+              <w:t>Размер команд в байтах</w:t>
             </w:r>
           </w:p>
         </w:tc>
@@ -8811,16 +8848,9 @@
               <w:jc w:val="center"/>
               <w:rPr>
                 <w:rFonts w:ascii="Bahnschrift" w:hAnsi="Bahnschrift"/>
-                <w:lang w:val="en-US" w:eastAsia="ru-RU"/>
-              </w:rPr>
-            </w:pPr>
-            <w:r>
-              <w:rPr>
-                <w:rFonts w:ascii="Bahnschrift" w:hAnsi="Bahnschrift"/>
-                <w:lang w:val="en-US" w:eastAsia="ru-RU"/>
-              </w:rPr>
-              <w:t>-</w:t>
-            </w:r>
+                <w:lang w:eastAsia="ru-RU"/>
+              </w:rPr>
+            </w:pPr>
           </w:p>
         </w:tc>
         <w:tc>
@@ -8833,15 +8863,15 @@
               <w:jc w:val="center"/>
               <w:rPr>
                 <w:rFonts w:ascii="Bahnschrift" w:hAnsi="Bahnschrift"/>
-                <w:lang w:val="en-US" w:eastAsia="ru-RU"/>
-              </w:rPr>
-            </w:pPr>
-            <w:r>
-              <w:rPr>
-                <w:rFonts w:ascii="Bahnschrift" w:hAnsi="Bahnschrift"/>
-                <w:lang w:val="en-US" w:eastAsia="ru-RU"/>
-              </w:rPr>
-              <w:t>-</w:t>
+                <w:lang w:eastAsia="ru-RU"/>
+              </w:rPr>
+            </w:pPr>
+            <w:r>
+              <w:rPr>
+                <w:rFonts w:ascii="Bahnschrift" w:hAnsi="Bahnschrift"/>
+                <w:lang w:eastAsia="ru-RU"/>
+              </w:rPr>
+              <w:t>8</w:t>
             </w:r>
           </w:p>
         </w:tc>
@@ -8858,36 +8888,28 @@
                 <w:lang w:eastAsia="ru-RU"/>
               </w:rPr>
             </w:pPr>
-            <w:proofErr w:type="spellStart"/>
-            <w:r>
-              <w:rPr>
-                <w:rFonts w:ascii="Bahnschrift" w:hAnsi="Bahnschrift"/>
-                <w:lang w:val="en-US" w:eastAsia="ru-RU"/>
-              </w:rPr>
-              <w:t>rod_offset</w:t>
-            </w:r>
-            <w:proofErr w:type="spellEnd"/>
+            <w:r>
+              <w:rPr>
+                <w:rFonts w:ascii="Bahnschrift" w:hAnsi="Bahnschrift"/>
+                <w:lang w:eastAsia="ru-RU"/>
+              </w:rPr>
+              <w:t>35</w:t>
+            </w:r>
           </w:p>
         </w:tc>
         <w:tc>
           <w:tcPr>
             <w:tcW w:w="2370" w:type="dxa"/>
-            <w:vAlign w:val="center"/>
-          </w:tcPr>
-          <w:p>
-            <w:pPr>
-              <w:rPr>
-                <w:rFonts w:ascii="Bahnschrift" w:hAnsi="Bahnschrift"/>
-                <w:lang w:val="en-US" w:eastAsia="ru-RU"/>
-              </w:rPr>
-            </w:pPr>
-            <w:r>
-              <w:rPr>
-                <w:rFonts w:ascii="Bahnschrift" w:hAnsi="Bahnschrift"/>
-                <w:lang w:val="en-US" w:eastAsia="ru-RU"/>
-              </w:rPr>
-              <w:t>ROD</w:t>
-            </w:r>
+            <w:vMerge/>
+            <w:vAlign w:val="center"/>
+          </w:tcPr>
+          <w:p>
+            <w:pPr>
+              <w:rPr>
+                <w:rFonts w:ascii="Bahnschrift" w:hAnsi="Bahnschrift"/>
+                <w:lang w:eastAsia="ru-RU"/>
+              </w:rPr>
+            </w:pPr>
           </w:p>
         </w:tc>
       </w:tr>
@@ -8905,6 +8927,151 @@
               <w:jc w:val="center"/>
               <w:rPr>
                 <w:rFonts w:ascii="Bahnschrift" w:hAnsi="Bahnschrift"/>
+                <w:lang w:val="en-US" w:eastAsia="ru-RU"/>
+              </w:rPr>
+            </w:pPr>
+            <w:r>
+              <w:rPr>
+                <w:rFonts w:ascii="Bahnschrift" w:hAnsi="Bahnschrift"/>
+                <w:lang w:val="en-US" w:eastAsia="ru-RU"/>
+              </w:rPr>
+              <w:t>rod</w:t>
+            </w:r>
+          </w:p>
+        </w:tc>
+        <w:tc>
+          <w:tcPr>
+            <w:tcW w:w="1994" w:type="dxa"/>
+            <w:vAlign w:val="center"/>
+          </w:tcPr>
+          <w:p>
+            <w:pPr>
+              <w:jc w:val="center"/>
+              <w:rPr>
+                <w:rFonts w:ascii="Bahnschrift" w:hAnsi="Bahnschrift"/>
+                <w:lang w:eastAsia="ru-RU"/>
+              </w:rPr>
+            </w:pPr>
+            <w:r>
+              <w:rPr>
+                <w:rFonts w:ascii="Bahnschrift" w:hAnsi="Bahnschrift"/>
+                <w:lang w:eastAsia="ru-RU"/>
+              </w:rPr>
+              <w:t>Данные только для чтения</w:t>
+            </w:r>
+            <w:r>
+              <w:rPr>
+                <w:rFonts w:ascii="Bahnschrift" w:hAnsi="Bahnschrift"/>
+                <w:lang w:eastAsia="ru-RU"/>
+              </w:rPr>
+              <w:t>.</w:t>
+            </w:r>
+          </w:p>
+        </w:tc>
+        <w:tc>
+          <w:tcPr>
+            <w:tcW w:w="1446" w:type="dxa"/>
+            <w:vAlign w:val="center"/>
+          </w:tcPr>
+          <w:p>
+            <w:pPr>
+              <w:jc w:val="center"/>
+              <w:rPr>
+                <w:rFonts w:ascii="Bahnschrift" w:hAnsi="Bahnschrift"/>
+                <w:lang w:val="en-US" w:eastAsia="ru-RU"/>
+              </w:rPr>
+            </w:pPr>
+            <w:r>
+              <w:rPr>
+                <w:rFonts w:ascii="Bahnschrift" w:hAnsi="Bahnschrift"/>
+                <w:lang w:val="en-US" w:eastAsia="ru-RU"/>
+              </w:rPr>
+              <w:t>-</w:t>
+            </w:r>
+          </w:p>
+        </w:tc>
+        <w:tc>
+          <w:tcPr>
+            <w:tcW w:w="991" w:type="dxa"/>
+            <w:vAlign w:val="center"/>
+          </w:tcPr>
+          <w:p>
+            <w:pPr>
+              <w:jc w:val="center"/>
+              <w:rPr>
+                <w:rFonts w:ascii="Bahnschrift" w:hAnsi="Bahnschrift"/>
+                <w:lang w:val="en-US" w:eastAsia="ru-RU"/>
+              </w:rPr>
+            </w:pPr>
+            <w:r>
+              <w:rPr>
+                <w:rFonts w:ascii="Bahnschrift" w:hAnsi="Bahnschrift"/>
+                <w:lang w:val="en-US" w:eastAsia="ru-RU"/>
+              </w:rPr>
+              <w:t>-</w:t>
+            </w:r>
+          </w:p>
+        </w:tc>
+        <w:tc>
+          <w:tcPr>
+            <w:tcW w:w="1667" w:type="dxa"/>
+            <w:vAlign w:val="center"/>
+          </w:tcPr>
+          <w:p>
+            <w:pPr>
+              <w:jc w:val="center"/>
+              <w:rPr>
+                <w:rFonts w:ascii="Bahnschrift" w:hAnsi="Bahnschrift"/>
+                <w:lang w:eastAsia="ru-RU"/>
+              </w:rPr>
+            </w:pPr>
+            <w:proofErr w:type="spellStart"/>
+            <w:r>
+              <w:rPr>
+                <w:rFonts w:ascii="Bahnschrift" w:hAnsi="Bahnschrift"/>
+                <w:lang w:val="en-US" w:eastAsia="ru-RU"/>
+              </w:rPr>
+              <w:t>rod_offset</w:t>
+            </w:r>
+            <w:proofErr w:type="spellEnd"/>
+          </w:p>
+        </w:tc>
+        <w:tc>
+          <w:tcPr>
+            <w:tcW w:w="2370" w:type="dxa"/>
+            <w:vAlign w:val="center"/>
+          </w:tcPr>
+          <w:p>
+            <w:pPr>
+              <w:rPr>
+                <w:rFonts w:ascii="Bahnschrift" w:hAnsi="Bahnschrift"/>
+                <w:lang w:eastAsia="ru-RU"/>
+              </w:rPr>
+            </w:pPr>
+            <w:r>
+              <w:rPr>
+                <w:rFonts w:ascii="Bahnschrift" w:hAnsi="Bahnschrift"/>
+                <w:lang w:val="en-US" w:eastAsia="ru-RU"/>
+              </w:rPr>
+              <w:t>ROD</w:t>
+            </w:r>
+          </w:p>
+        </w:tc>
+      </w:tr>
+      <w:tr>
+        <w:trPr>
+          <w:trHeight w:val="303"/>
+        </w:trPr>
+        <w:tc>
+          <w:tcPr>
+            <w:tcW w:w="2021" w:type="dxa"/>
+            <w:vAlign w:val="center"/>
+          </w:tcPr>
+          <w:p>
+            <w:pPr>
+              <w:jc w:val="center"/>
+              <w:rPr>
+                <w:rFonts w:ascii="Bahnschrift" w:hAnsi="Bahnschrift"/>
                 <w:lang w:eastAsia="ru-RU"/>
               </w:rPr>
             </w:pPr>
@@ -9227,7 +9394,7 @@
           <w:szCs w:val="28"/>
           <w:lang w:val="en-US" w:eastAsia="ru-RU"/>
         </w:rPr>
-        <w:t>code</w:t>
+        <w:t>rod</w:t>
       </w:r>
       <w:r>
         <w:rPr>
@@ -9245,43 +9412,7 @@
           <w:szCs w:val="28"/>
           <w:lang w:val="en-US" w:eastAsia="ru-RU"/>
         </w:rPr>
-        <w:t>offset</w:t>
-      </w:r>
-      <w:r>
-        <w:rPr>
-          <w:rFonts w:ascii="Bahnschrift" w:hAnsi="Bahnschrift"/>
-          <w:sz w:val="28"/>
-          <w:szCs w:val="28"/>
-          <w:lang w:eastAsia="ru-RU"/>
-        </w:rPr>
-        <w:t>-</w:t>
-      </w:r>
-      <w:r>
-        <w:rPr>
-          <w:rFonts w:ascii="Bahnschrift" w:hAnsi="Bahnschrift"/>
-          <w:sz w:val="28"/>
-          <w:szCs w:val="28"/>
-          <w:lang w:val="en-US" w:eastAsia="ru-RU"/>
-        </w:rPr>
-        <w:t>rod</w:t>
-      </w:r>
-      <w:r>
-        <w:rPr>
-          <w:rFonts w:ascii="Bahnschrift" w:hAnsi="Bahnschrift"/>
-          <w:sz w:val="28"/>
-          <w:szCs w:val="28"/>
-          <w:lang w:eastAsia="ru-RU"/>
-        </w:rPr>
-        <w:t>_</w:t>
-      </w:r>
-      <w:r>
-        <w:rPr>
-          <w:rFonts w:ascii="Bahnschrift" w:hAnsi="Bahnschrift"/>
-          <w:sz w:val="28"/>
-          <w:szCs w:val="28"/>
-          <w:lang w:val="en-US" w:eastAsia="ru-RU"/>
-        </w:rPr>
-        <w:t>offset</w:t>
+        <w:t>size</w:t>
       </w:r>
       <w:r>
         <w:rPr>
@@ -9456,114 +9587,6 @@
           <w:lang w:eastAsia="ru-RU"/>
         </w:rPr>
         <w:t xml:space="preserve"> переписывать свои загрузчики, то есть ради обратной совместимости. </w:t>
-      </w:r>
-      <w:r>
-        <w:rPr>
-          <w:rFonts w:ascii="Bahnschrift" w:hAnsi="Bahnschrift"/>
-          <w:sz w:val="28"/>
-          <w:szCs w:val="28"/>
-          <w:lang w:val="en-US" w:eastAsia="ru-RU"/>
-        </w:rPr>
-        <w:t>ROD</w:t>
-      </w:r>
-      <w:r>
-        <w:rPr>
-          <w:rFonts w:ascii="Bahnschrift" w:hAnsi="Bahnschrift"/>
-          <w:sz w:val="28"/>
-          <w:szCs w:val="28"/>
-          <w:lang w:eastAsia="ru-RU"/>
-        </w:rPr>
-        <w:t xml:space="preserve"> размер не нужен, так как её размер определяется </w:t>
-      </w:r>
-      <w:r>
-        <w:rPr>
-          <w:rFonts w:ascii="Bahnschrift" w:hAnsi="Bahnschrift"/>
-          <w:sz w:val="28"/>
-          <w:szCs w:val="28"/>
-          <w:lang w:val="en-US" w:eastAsia="ru-RU"/>
-        </w:rPr>
-        <w:t>code</w:t>
-      </w:r>
-      <w:r>
-        <w:rPr>
-          <w:rFonts w:ascii="Bahnschrift" w:hAnsi="Bahnschrift"/>
-          <w:sz w:val="28"/>
-          <w:szCs w:val="28"/>
-          <w:lang w:eastAsia="ru-RU"/>
-        </w:rPr>
-        <w:t>_</w:t>
-      </w:r>
-      <w:r>
-        <w:rPr>
-          <w:rFonts w:ascii="Bahnschrift" w:hAnsi="Bahnschrift"/>
-          <w:sz w:val="28"/>
-          <w:szCs w:val="28"/>
-          <w:lang w:val="en-US" w:eastAsia="ru-RU"/>
-        </w:rPr>
-        <w:t>offset</w:t>
-      </w:r>
-      <w:r>
-        <w:rPr>
-          <w:rFonts w:ascii="Bahnschrift" w:hAnsi="Bahnschrift"/>
-          <w:sz w:val="28"/>
-          <w:szCs w:val="28"/>
-          <w:lang w:eastAsia="ru-RU"/>
-        </w:rPr>
-        <w:t>-</w:t>
-      </w:r>
-      <w:r>
-        <w:rPr>
-          <w:rFonts w:ascii="Bahnschrift" w:hAnsi="Bahnschrift"/>
-          <w:sz w:val="28"/>
-          <w:szCs w:val="28"/>
-          <w:lang w:val="en-US" w:eastAsia="ru-RU"/>
-        </w:rPr>
-        <w:t>rod</w:t>
-      </w:r>
-      <w:r>
-        <w:rPr>
-          <w:rFonts w:ascii="Bahnschrift" w:hAnsi="Bahnschrift"/>
-          <w:sz w:val="28"/>
-          <w:szCs w:val="28"/>
-          <w:lang w:eastAsia="ru-RU"/>
-        </w:rPr>
-        <w:t>_</w:t>
-      </w:r>
-      <w:r>
-        <w:rPr>
-          <w:rFonts w:ascii="Bahnschrift" w:hAnsi="Bahnschrift"/>
-          <w:sz w:val="28"/>
-          <w:szCs w:val="28"/>
-          <w:lang w:val="en-US" w:eastAsia="ru-RU"/>
-        </w:rPr>
-        <w:t>offset</w:t>
-      </w:r>
-      <w:r>
-        <w:rPr>
-          <w:rFonts w:ascii="Bahnschrift" w:hAnsi="Bahnschrift"/>
-          <w:sz w:val="28"/>
-          <w:szCs w:val="28"/>
-          <w:lang w:eastAsia="ru-RU"/>
-        </w:rPr>
-        <w:t>, следовательно, если не будет секции команд, то файл битый</w:t>
-      </w:r>
-      <w:r>
-        <w:rPr>
-          <w:rFonts w:ascii="Bahnschrift" w:hAnsi="Bahnschrift"/>
-          <w:sz w:val="28"/>
-          <w:szCs w:val="28"/>
-          <w:lang w:eastAsia="ru-RU"/>
-        </w:rPr>
-        <w:t xml:space="preserve"> (нужно будет сделать проверку на смещения и размер файла)</w:t>
-      </w:r>
-      <w:r>
-        <w:rPr>
-          <w:rFonts w:ascii="Bahnschrift" w:hAnsi="Bahnschrift"/>
-          <w:sz w:val="28"/>
-          <w:szCs w:val="28"/>
-          <w:lang w:eastAsia="ru-RU"/>
-        </w:rPr>
-        <w:t>.</w:t>
       </w:r>
     </w:p>
     <w:sectPr>

</xml_diff>

<commit_message>
Zero changes. I just scare about losting this project on my PC
</commit_message>
<xml_diff>
--- a/Documentation/MSLObjectsStructureRU.docx
+++ b/Documentation/MSLObjectsStructureRU.docx
@@ -386,6 +386,7 @@
         </w:rPr>
         <w:t xml:space="preserve"> </w:t>
       </w:r>
+      <w:proofErr w:type="gramStart"/>
       <w:r>
         <w:rPr>
           <w:rFonts w:ascii="Bahnschrift" w:hAnsi="Bahnschrift"/>
@@ -411,7 +412,17 @@
           <w:szCs w:val="28"/>
           <w:lang w:eastAsia="ru-RU"/>
         </w:rPr>
-        <w:t xml:space="preserve"> и </w:t>
+        <w:t xml:space="preserve"> и</w:t>
+      </w:r>
+      <w:proofErr w:type="gramEnd"/>
+      <w:r>
+        <w:rPr>
+          <w:rFonts w:ascii="Bahnschrift" w:hAnsi="Bahnschrift"/>
+          <w:sz w:val="28"/>
+          <w:szCs w:val="28"/>
+          <w:lang w:eastAsia="ru-RU"/>
+        </w:rPr>
+        <w:t xml:space="preserve"> </w:t>
       </w:r>
       <w:r>
         <w:rPr>
@@ -681,8 +692,19 @@
           <w:szCs w:val="28"/>
           <w:lang w:eastAsia="ru-RU"/>
         </w:rPr>
-        <w:t xml:space="preserve"> порядок обработки файлов .</w:t>
-      </w:r>
+        <w:t xml:space="preserve"> порядок обработки </w:t>
+      </w:r>
+      <w:proofErr w:type="gramStart"/>
+      <w:r>
+        <w:rPr>
+          <w:rFonts w:ascii="Bahnschrift" w:hAnsi="Bahnschrift"/>
+          <w:sz w:val="28"/>
+          <w:szCs w:val="28"/>
+          <w:lang w:eastAsia="ru-RU"/>
+        </w:rPr>
+        <w:t>файлов .</w:t>
+      </w:r>
+      <w:proofErr w:type="spellStart"/>
       <w:r>
         <w:rPr>
           <w:rFonts w:ascii="Bahnschrift" w:hAnsi="Bahnschrift"/>
@@ -692,6 +714,8 @@
         </w:rPr>
         <w:t>mslco</w:t>
       </w:r>
+      <w:proofErr w:type="spellEnd"/>
+      <w:proofErr w:type="gramEnd"/>
       <w:r>
         <w:rPr>
           <w:rFonts w:ascii="Bahnschrift" w:hAnsi="Bahnschrift"/>
@@ -800,14 +824,25 @@
           <w:lang w:eastAsia="ru-RU"/>
         </w:rPr>
       </w:pPr>
-      <w:r>
-        <w:rPr>
-          <w:rFonts w:ascii="Bahnschrift" w:hAnsi="Bahnschrift"/>
-          <w:sz w:val="28"/>
-          <w:szCs w:val="28"/>
-          <w:lang w:eastAsia="ru-RU"/>
-        </w:rPr>
-        <w:t xml:space="preserve">Дебаг информация. На данный момент </w:t>
+      <w:proofErr w:type="spellStart"/>
+      <w:r>
+        <w:rPr>
+          <w:rFonts w:ascii="Bahnschrift" w:hAnsi="Bahnschrift"/>
+          <w:sz w:val="28"/>
+          <w:szCs w:val="28"/>
+          <w:lang w:eastAsia="ru-RU"/>
+        </w:rPr>
+        <w:t>Дебаг</w:t>
+      </w:r>
+      <w:proofErr w:type="spellEnd"/>
+      <w:r>
+        <w:rPr>
+          <w:rFonts w:ascii="Bahnschrift" w:hAnsi="Bahnschrift"/>
+          <w:sz w:val="28"/>
+          <w:szCs w:val="28"/>
+          <w:lang w:eastAsia="ru-RU"/>
+        </w:rPr>
+        <w:t xml:space="preserve"> информация. На данный момент </w:t>
       </w:r>
       <w:r>
         <w:rPr>
@@ -1487,6 +1522,7 @@
                 <w:lang w:eastAsia="ru-RU"/>
               </w:rPr>
             </w:pPr>
+            <w:proofErr w:type="spellStart"/>
             <w:r>
               <w:rPr>
                 <w:rFonts w:ascii="Bahnschrift" w:hAnsi="Bahnschrift"/>
@@ -1494,6 +1530,7 @@
               </w:rPr>
               <w:t>module_file_prefix</w:t>
             </w:r>
+            <w:proofErr w:type="spellEnd"/>
           </w:p>
         </w:tc>
         <w:tc>
@@ -1532,6 +1569,8 @@
                 <w:lang w:val="en-US" w:eastAsia="ru-RU"/>
               </w:rPr>
             </w:pPr>
+            <w:proofErr w:type="spellStart"/>
+            <w:proofErr w:type="gramStart"/>
             <w:r>
               <w:rPr>
                 <w:rFonts w:ascii="Bahnschrift" w:hAnsi="Bahnschrift"/>
@@ -1539,6 +1578,8 @@
               </w:rPr>
               <w:t>module.mslco</w:t>
             </w:r>
+            <w:proofErr w:type="spellEnd"/>
+            <w:proofErr w:type="gramEnd"/>
           </w:p>
         </w:tc>
         <w:tc>
@@ -1559,7 +1600,23 @@
                 <w:rFonts w:ascii="Bahnschrift" w:hAnsi="Bahnschrift"/>
                 <w:lang w:val="en-US" w:eastAsia="ru-RU"/>
               </w:rPr>
-              <w:t>“mslmodule”</w:t>
+              <w:t>“</w:t>
+            </w:r>
+            <w:proofErr w:type="spellStart"/>
+            <w:r>
+              <w:rPr>
+                <w:rFonts w:ascii="Bahnschrift" w:hAnsi="Bahnschrift"/>
+                <w:lang w:val="en-US" w:eastAsia="ru-RU"/>
+              </w:rPr>
+              <w:t>mslmodule</w:t>
+            </w:r>
+            <w:proofErr w:type="spellEnd"/>
+            <w:r>
+              <w:rPr>
+                <w:rFonts w:ascii="Bahnschrift" w:hAnsi="Bahnschrift"/>
+                <w:lang w:val="en-US" w:eastAsia="ru-RU"/>
+              </w:rPr>
+              <w:t>”</w:t>
             </w:r>
           </w:p>
         </w:tc>
@@ -1638,6 +1695,7 @@
                 <w:lang w:eastAsia="ru-RU"/>
               </w:rPr>
             </w:pPr>
+            <w:proofErr w:type="spellStart"/>
             <w:r>
               <w:rPr>
                 <w:rFonts w:ascii="Bahnschrift" w:hAnsi="Bahnschrift"/>
@@ -1652,6 +1710,7 @@
               </w:rPr>
               <w:t>extension</w:t>
             </w:r>
+            <w:proofErr w:type="spellEnd"/>
           </w:p>
         </w:tc>
         <w:tc>
@@ -1694,7 +1753,23 @@
                 <w:rFonts w:ascii="Bahnschrift" w:hAnsi="Bahnschrift"/>
                 <w:lang w:val="en-US" w:eastAsia="ru-RU"/>
               </w:rPr>
-              <w:t>“mslco”</w:t>
+              <w:t>“</w:t>
+            </w:r>
+            <w:proofErr w:type="spellStart"/>
+            <w:r>
+              <w:rPr>
+                <w:rFonts w:ascii="Bahnschrift" w:hAnsi="Bahnschrift"/>
+                <w:lang w:val="en-US" w:eastAsia="ru-RU"/>
+              </w:rPr>
+              <w:t>mslco</w:t>
+            </w:r>
+            <w:proofErr w:type="spellEnd"/>
+            <w:r>
+              <w:rPr>
+                <w:rFonts w:ascii="Bahnschrift" w:hAnsi="Bahnschrift"/>
+                <w:lang w:val="en-US" w:eastAsia="ru-RU"/>
+              </w:rPr>
+              <w:t>”</w:t>
             </w:r>
           </w:p>
         </w:tc>
@@ -1773,6 +1848,7 @@
                 <w:lang w:val="en-US" w:eastAsia="ru-RU"/>
               </w:rPr>
             </w:pPr>
+            <w:proofErr w:type="spellStart"/>
             <w:r>
               <w:rPr>
                 <w:rFonts w:ascii="Bahnschrift" w:hAnsi="Bahnschrift"/>
@@ -1780,6 +1856,7 @@
               </w:rPr>
               <w:t>loi_section</w:t>
             </w:r>
+            <w:proofErr w:type="spellEnd"/>
           </w:p>
         </w:tc>
         <w:tc>
@@ -1795,6 +1872,7 @@
                 <w:lang w:eastAsia="ru-RU"/>
               </w:rPr>
             </w:pPr>
+            <w:proofErr w:type="spellStart"/>
             <w:r>
               <w:rPr>
                 <w:rFonts w:ascii="Bahnschrift" w:hAnsi="Bahnschrift"/>
@@ -1802,6 +1880,7 @@
               </w:rPr>
               <w:t>LinkingOrder</w:t>
             </w:r>
+            <w:proofErr w:type="spellEnd"/>
             <w:r>
               <w:rPr>
                 <w:rFonts w:ascii="Bahnschrift" w:hAnsi="Bahnschrift"/>
@@ -1944,6 +2023,7 @@
                 <w:lang w:val="en-US" w:eastAsia="ru-RU"/>
               </w:rPr>
             </w:pPr>
+            <w:proofErr w:type="spellStart"/>
             <w:r>
               <w:rPr>
                 <w:rFonts w:ascii="Bahnschrift" w:hAnsi="Bahnschrift"/>
@@ -1951,6 +2031,7 @@
               </w:rPr>
               <w:t>ci_section</w:t>
             </w:r>
+            <w:proofErr w:type="spellEnd"/>
           </w:p>
         </w:tc>
         <w:tc>
@@ -2080,6 +2161,7 @@
                 <w:lang w:val="en-US" w:eastAsia="ru-RU"/>
               </w:rPr>
             </w:pPr>
+            <w:proofErr w:type="spellStart"/>
             <w:r>
               <w:rPr>
                 <w:rFonts w:ascii="Bahnschrift" w:hAnsi="Bahnschrift"/>
@@ -2087,6 +2169,7 @@
               </w:rPr>
               <w:t>si_section</w:t>
             </w:r>
+            <w:proofErr w:type="spellEnd"/>
           </w:p>
         </w:tc>
         <w:tc>
@@ -2216,6 +2299,7 @@
                 <w:lang w:val="en-US" w:eastAsia="ru-RU"/>
               </w:rPr>
             </w:pPr>
+            <w:proofErr w:type="spellStart"/>
             <w:r>
               <w:rPr>
                 <w:rFonts w:ascii="Bahnschrift" w:hAnsi="Bahnschrift"/>
@@ -2223,6 +2307,7 @@
               </w:rPr>
               <w:t>di_section</w:t>
             </w:r>
+            <w:proofErr w:type="spellEnd"/>
           </w:p>
         </w:tc>
         <w:tc>
@@ -2598,6 +2683,7 @@
         </w:rPr>
         <w:t xml:space="preserve"> </w:t>
       </w:r>
+      <w:proofErr w:type="spellStart"/>
       <w:r>
         <w:rPr>
           <w:rFonts w:ascii="Bahnschrift" w:hAnsi="Bahnschrift"/>
@@ -2607,6 +2693,7 @@
         </w:rPr>
         <w:t>linking_order</w:t>
       </w:r>
+      <w:proofErr w:type="spellEnd"/>
     </w:p>
     <w:p>
       <w:pPr>
@@ -2862,14 +2949,25 @@
                 <w:lang w:eastAsia="ru-RU"/>
               </w:rPr>
             </w:pPr>
-            <w:r>
-              <w:rPr>
-                <w:rFonts w:ascii="Bahnschrift" w:hAnsi="Bahnschrift"/>
-                <w:sz w:val="28"/>
-                <w:szCs w:val="28"/>
-                <w:lang w:eastAsia="ru-RU"/>
-              </w:rPr>
-              <w:t>Тип(1 байт)</w:t>
+            <w:proofErr w:type="gramStart"/>
+            <w:r>
+              <w:rPr>
+                <w:rFonts w:ascii="Bahnschrift" w:hAnsi="Bahnschrift"/>
+                <w:sz w:val="28"/>
+                <w:szCs w:val="28"/>
+                <w:lang w:eastAsia="ru-RU"/>
+              </w:rPr>
+              <w:t>Тип(</w:t>
+            </w:r>
+            <w:proofErr w:type="gramEnd"/>
+            <w:r>
+              <w:rPr>
+                <w:rFonts w:ascii="Bahnschrift" w:hAnsi="Bahnschrift"/>
+                <w:sz w:val="28"/>
+                <w:szCs w:val="28"/>
+                <w:lang w:eastAsia="ru-RU"/>
+              </w:rPr>
+              <w:t>1 байт)</w:t>
             </w:r>
           </w:p>
         </w:tc>
@@ -2987,6 +3085,8 @@
                 <w:lang w:val="en-US" w:eastAsia="ru-RU"/>
               </w:rPr>
             </w:pPr>
+            <w:proofErr w:type="spellStart"/>
+            <w:proofErr w:type="gramStart"/>
             <w:r>
               <w:rPr>
                 <w:rFonts w:ascii="Bahnschrift" w:hAnsi="Bahnschrift"/>
@@ -2996,6 +3096,8 @@
               </w:rPr>
               <w:t>data.offset</w:t>
             </w:r>
+            <w:proofErr w:type="spellEnd"/>
+            <w:proofErr w:type="gramEnd"/>
           </w:p>
         </w:tc>
         <w:tc>
@@ -3011,6 +3113,7 @@
                 <w:lang w:val="en-US" w:eastAsia="ru-RU"/>
               </w:rPr>
             </w:pPr>
+            <w:proofErr w:type="spellStart"/>
             <w:r>
               <w:rPr>
                 <w:rFonts w:ascii="Bahnschrift" w:hAnsi="Bahnschrift"/>
@@ -3020,6 +3123,7 @@
               </w:rPr>
               <w:t>lsize</w:t>
             </w:r>
+            <w:proofErr w:type="spellEnd"/>
           </w:p>
         </w:tc>
       </w:tr>
@@ -3088,14 +3192,27 @@
                 <w:lang w:val="en-US" w:eastAsia="ru-RU"/>
               </w:rPr>
             </w:pPr>
-            <w:r>
-              <w:rPr>
-                <w:rFonts w:ascii="Bahnschrift" w:hAnsi="Bahnschrift"/>
-                <w:sz w:val="28"/>
-                <w:szCs w:val="28"/>
-                <w:lang w:val="en-US" w:eastAsia="ru-RU"/>
-              </w:rPr>
-              <w:t xml:space="preserve">data.offset </w:t>
+            <w:proofErr w:type="spellStart"/>
+            <w:proofErr w:type="gramStart"/>
+            <w:r>
+              <w:rPr>
+                <w:rFonts w:ascii="Bahnschrift" w:hAnsi="Bahnschrift"/>
+                <w:sz w:val="28"/>
+                <w:szCs w:val="28"/>
+                <w:lang w:val="en-US" w:eastAsia="ru-RU"/>
+              </w:rPr>
+              <w:t>data.offset</w:t>
+            </w:r>
+            <w:proofErr w:type="spellEnd"/>
+            <w:proofErr w:type="gramEnd"/>
+            <w:r>
+              <w:rPr>
+                <w:rFonts w:ascii="Bahnschrift" w:hAnsi="Bahnschrift"/>
+                <w:sz w:val="28"/>
+                <w:szCs w:val="28"/>
+                <w:lang w:val="en-US" w:eastAsia="ru-RU"/>
+              </w:rPr>
+              <w:t xml:space="preserve"> </w:t>
             </w:r>
             <w:r>
               <w:rPr>
@@ -3115,6 +3232,7 @@
               </w:rPr>
               <w:t xml:space="preserve"> </w:t>
             </w:r>
+            <w:proofErr w:type="spellStart"/>
             <w:r>
               <w:rPr>
                 <w:rFonts w:ascii="Bahnschrift" w:hAnsi="Bahnschrift"/>
@@ -3124,6 +3242,7 @@
               </w:rPr>
               <w:t>lsize</w:t>
             </w:r>
+            <w:proofErr w:type="spellEnd"/>
           </w:p>
         </w:tc>
         <w:tc>
@@ -3139,6 +3258,7 @@
                 <w:lang w:val="en-US" w:eastAsia="ru-RU"/>
               </w:rPr>
             </w:pPr>
+            <w:proofErr w:type="spellStart"/>
             <w:r>
               <w:rPr>
                 <w:rFonts w:ascii="Bahnschrift" w:hAnsi="Bahnschrift"/>
@@ -3148,6 +3268,7 @@
               </w:rPr>
               <w:t>csize</w:t>
             </w:r>
+            <w:proofErr w:type="spellEnd"/>
           </w:p>
         </w:tc>
       </w:tr>
@@ -3216,14 +3337,27 @@
                 <w:lang w:eastAsia="ru-RU"/>
               </w:rPr>
             </w:pPr>
-            <w:r>
-              <w:rPr>
-                <w:rFonts w:ascii="Bahnschrift" w:hAnsi="Bahnschrift"/>
-                <w:sz w:val="28"/>
-                <w:szCs w:val="28"/>
-                <w:lang w:val="en-US" w:eastAsia="ru-RU"/>
-              </w:rPr>
-              <w:t xml:space="preserve">data.offset </w:t>
+            <w:proofErr w:type="spellStart"/>
+            <w:proofErr w:type="gramStart"/>
+            <w:r>
+              <w:rPr>
+                <w:rFonts w:ascii="Bahnschrift" w:hAnsi="Bahnschrift"/>
+                <w:sz w:val="28"/>
+                <w:szCs w:val="28"/>
+                <w:lang w:val="en-US" w:eastAsia="ru-RU"/>
+              </w:rPr>
+              <w:t>data.offset</w:t>
+            </w:r>
+            <w:proofErr w:type="spellEnd"/>
+            <w:proofErr w:type="gramEnd"/>
+            <w:r>
+              <w:rPr>
+                <w:rFonts w:ascii="Bahnschrift" w:hAnsi="Bahnschrift"/>
+                <w:sz w:val="28"/>
+                <w:szCs w:val="28"/>
+                <w:lang w:val="en-US" w:eastAsia="ru-RU"/>
+              </w:rPr>
+              <w:t xml:space="preserve"> </w:t>
             </w:r>
             <w:r>
               <w:rPr>
@@ -3243,6 +3377,7 @@
               </w:rPr>
               <w:t xml:space="preserve"> </w:t>
             </w:r>
+            <w:proofErr w:type="spellStart"/>
             <w:r>
               <w:rPr>
                 <w:rFonts w:ascii="Bahnschrift" w:hAnsi="Bahnschrift"/>
@@ -3252,6 +3387,7 @@
               </w:rPr>
               <w:t>lsize</w:t>
             </w:r>
+            <w:proofErr w:type="spellEnd"/>
             <w:r>
               <w:rPr>
                 <w:rFonts w:ascii="Bahnschrift" w:hAnsi="Bahnschrift"/>
@@ -3279,6 +3415,7 @@
               </w:rPr>
               <w:t xml:space="preserve"> </w:t>
             </w:r>
+            <w:proofErr w:type="spellStart"/>
             <w:r>
               <w:rPr>
                 <w:rFonts w:ascii="Bahnschrift" w:hAnsi="Bahnschrift"/>
@@ -3288,6 +3425,7 @@
               </w:rPr>
               <w:t>csize</w:t>
             </w:r>
+            <w:proofErr w:type="spellEnd"/>
           </w:p>
         </w:tc>
         <w:tc>
@@ -3303,6 +3441,7 @@
                 <w:lang w:val="en-US" w:eastAsia="ru-RU"/>
               </w:rPr>
             </w:pPr>
+            <w:proofErr w:type="spellStart"/>
             <w:r>
               <w:rPr>
                 <w:rFonts w:ascii="Bahnschrift" w:hAnsi="Bahnschrift"/>
@@ -3312,6 +3451,7 @@
               </w:rPr>
               <w:t>ssize</w:t>
             </w:r>
+            <w:proofErr w:type="spellEnd"/>
           </w:p>
         </w:tc>
       </w:tr>
@@ -3380,14 +3520,27 @@
                 <w:lang w:val="en-US" w:eastAsia="ru-RU"/>
               </w:rPr>
             </w:pPr>
-            <w:r>
-              <w:rPr>
-                <w:rFonts w:ascii="Bahnschrift" w:hAnsi="Bahnschrift"/>
-                <w:sz w:val="28"/>
-                <w:szCs w:val="28"/>
-                <w:lang w:val="en-US" w:eastAsia="ru-RU"/>
-              </w:rPr>
-              <w:t xml:space="preserve">data.offset </w:t>
+            <w:proofErr w:type="spellStart"/>
+            <w:proofErr w:type="gramStart"/>
+            <w:r>
+              <w:rPr>
+                <w:rFonts w:ascii="Bahnschrift" w:hAnsi="Bahnschrift"/>
+                <w:sz w:val="28"/>
+                <w:szCs w:val="28"/>
+                <w:lang w:val="en-US" w:eastAsia="ru-RU"/>
+              </w:rPr>
+              <w:t>data.offset</w:t>
+            </w:r>
+            <w:proofErr w:type="spellEnd"/>
+            <w:proofErr w:type="gramEnd"/>
+            <w:r>
+              <w:rPr>
+                <w:rFonts w:ascii="Bahnschrift" w:hAnsi="Bahnschrift"/>
+                <w:sz w:val="28"/>
+                <w:szCs w:val="28"/>
+                <w:lang w:val="en-US" w:eastAsia="ru-RU"/>
+              </w:rPr>
+              <w:t xml:space="preserve"> </w:t>
             </w:r>
             <w:r>
               <w:rPr>
@@ -3407,6 +3560,7 @@
               </w:rPr>
               <w:t xml:space="preserve"> </w:t>
             </w:r>
+            <w:proofErr w:type="spellStart"/>
             <w:r>
               <w:rPr>
                 <w:rFonts w:ascii="Bahnschrift" w:hAnsi="Bahnschrift"/>
@@ -3416,6 +3570,7 @@
               </w:rPr>
               <w:t>lsize</w:t>
             </w:r>
+            <w:proofErr w:type="spellEnd"/>
             <w:r>
               <w:rPr>
                 <w:rFonts w:ascii="Bahnschrift" w:hAnsi="Bahnschrift"/>
@@ -3443,6 +3598,7 @@
               </w:rPr>
               <w:t xml:space="preserve"> </w:t>
             </w:r>
+            <w:proofErr w:type="spellStart"/>
             <w:r>
               <w:rPr>
                 <w:rFonts w:ascii="Bahnschrift" w:hAnsi="Bahnschrift"/>
@@ -3452,6 +3608,7 @@
               </w:rPr>
               <w:t>csize</w:t>
             </w:r>
+            <w:proofErr w:type="spellEnd"/>
             <w:r>
               <w:rPr>
                 <w:rFonts w:ascii="Bahnschrift" w:hAnsi="Bahnschrift"/>
@@ -3479,6 +3636,7 @@
               </w:rPr>
               <w:t xml:space="preserve"> </w:t>
             </w:r>
+            <w:proofErr w:type="spellStart"/>
             <w:r>
               <w:rPr>
                 <w:rFonts w:ascii="Bahnschrift" w:hAnsi="Bahnschrift"/>
@@ -3488,6 +3646,7 @@
               </w:rPr>
               <w:t>ssize</w:t>
             </w:r>
+            <w:proofErr w:type="spellEnd"/>
           </w:p>
         </w:tc>
         <w:tc>
@@ -3503,6 +3662,7 @@
                 <w:lang w:eastAsia="ru-RU"/>
               </w:rPr>
             </w:pPr>
+            <w:proofErr w:type="spellStart"/>
             <w:r>
               <w:rPr>
                 <w:rFonts w:ascii="Bahnschrift" w:hAnsi="Bahnschrift"/>
@@ -3512,6 +3672,7 @@
               </w:rPr>
               <w:t>dsize</w:t>
             </w:r>
+            <w:proofErr w:type="spellEnd"/>
           </w:p>
         </w:tc>
       </w:tr>
@@ -3626,8 +3787,19 @@
           <w:szCs w:val="28"/>
           <w:lang w:eastAsia="ru-RU"/>
         </w:rPr>
-        <w:t>к module_file_prefix</w:t>
-      </w:r>
+        <w:t xml:space="preserve">к </w:t>
+      </w:r>
+      <w:proofErr w:type="spellStart"/>
+      <w:r>
+        <w:rPr>
+          <w:rFonts w:ascii="Bahnschrift" w:hAnsi="Bahnschrift"/>
+          <w:sz w:val="28"/>
+          <w:szCs w:val="28"/>
+          <w:lang w:eastAsia="ru-RU"/>
+        </w:rPr>
+        <w:t>module_file_prefix</w:t>
+      </w:r>
+      <w:proofErr w:type="spellEnd"/>
       <w:r>
         <w:rPr>
           <w:rFonts w:ascii="Bahnschrift" w:hAnsi="Bahnschrift"/>
@@ -3673,6 +3845,7 @@
         </w:rPr>
         <w:t xml:space="preserve">– это и будет имя файла с кодом, который следует найти и загрузить, например, </w:t>
       </w:r>
+      <w:proofErr w:type="spellStart"/>
       <w:r>
         <w:rPr>
           <w:rFonts w:ascii="Bahnschrift" w:hAnsi="Bahnschrift"/>
@@ -3682,6 +3855,7 @@
         </w:rPr>
         <w:t>mslmodule</w:t>
       </w:r>
+      <w:proofErr w:type="spellEnd"/>
       <w:r>
         <w:rPr>
           <w:rFonts w:ascii="Bahnschrift" w:hAnsi="Bahnschrift"/>
@@ -3700,6 +3874,7 @@
         </w:rPr>
         <w:t>.</w:t>
       </w:r>
+      <w:proofErr w:type="spellStart"/>
       <w:r>
         <w:rPr>
           <w:rFonts w:ascii="Bahnschrift" w:hAnsi="Bahnschrift"/>
@@ -3709,6 +3884,7 @@
         </w:rPr>
         <w:t>mslco</w:t>
       </w:r>
+      <w:proofErr w:type="spellEnd"/>
       <w:r>
         <w:rPr>
           <w:rFonts w:ascii="Bahnschrift" w:hAnsi="Bahnschrift"/>
@@ -3727,6 +3903,7 @@
         </w:rPr>
         <w:t xml:space="preserve"> </w:t>
       </w:r>
+      <w:proofErr w:type="spellStart"/>
       <w:r>
         <w:rPr>
           <w:rFonts w:ascii="Bahnschrift" w:hAnsi="Bahnschrift"/>
@@ -3736,6 +3913,7 @@
         </w:rPr>
         <w:t>mslmodule</w:t>
       </w:r>
+      <w:proofErr w:type="spellEnd"/>
       <w:r>
         <w:rPr>
           <w:rFonts w:ascii="Bahnschrift" w:hAnsi="Bahnschrift"/>
@@ -3745,6 +3923,7 @@
         </w:rPr>
         <w:t>1.</w:t>
       </w:r>
+      <w:proofErr w:type="spellStart"/>
       <w:r>
         <w:rPr>
           <w:rFonts w:ascii="Bahnschrift" w:hAnsi="Bahnschrift"/>
@@ -3754,14 +3933,35 @@
         </w:rPr>
         <w:t>mslco</w:t>
       </w:r>
-      <w:r>
-        <w:rPr>
-          <w:rFonts w:ascii="Bahnschrift" w:hAnsi="Bahnschrift"/>
-          <w:sz w:val="28"/>
-          <w:szCs w:val="28"/>
-          <w:lang w:eastAsia="ru-RU"/>
-        </w:rPr>
-        <w:t xml:space="preserve"> и тд.</w:t>
+      <w:proofErr w:type="spellEnd"/>
+      <w:r>
+        <w:rPr>
+          <w:rFonts w:ascii="Bahnschrift" w:hAnsi="Bahnschrift"/>
+          <w:sz w:val="28"/>
+          <w:szCs w:val="28"/>
+          <w:lang w:eastAsia="ru-RU"/>
+        </w:rPr>
+        <w:t xml:space="preserve"> и </w:t>
+      </w:r>
+      <w:proofErr w:type="spellStart"/>
+      <w:r>
+        <w:rPr>
+          <w:rFonts w:ascii="Bahnschrift" w:hAnsi="Bahnschrift"/>
+          <w:sz w:val="28"/>
+          <w:szCs w:val="28"/>
+          <w:lang w:eastAsia="ru-RU"/>
+        </w:rPr>
+        <w:t>тд</w:t>
+      </w:r>
+      <w:proofErr w:type="spellEnd"/>
+      <w:r>
+        <w:rPr>
+          <w:rFonts w:ascii="Bahnschrift" w:hAnsi="Bahnschrift"/>
+          <w:sz w:val="28"/>
+          <w:szCs w:val="28"/>
+          <w:lang w:eastAsia="ru-RU"/>
+        </w:rPr>
+        <w:t>.</w:t>
       </w:r>
       <w:r>
         <w:rPr>
@@ -3887,7 +4087,27 @@
           <w:szCs w:val="28"/>
           <w:lang w:eastAsia="ru-RU"/>
         </w:rPr>
-        <w:t xml:space="preserve"> сторонний линкер не просто склейщик кода, а ещё и своеобразный транслятор в код платформы, считайте, что платформозависимая компиляция.</w:t>
+        <w:t xml:space="preserve"> сторонний линкер не просто склейщик кода, а ещё и своеобразный транслятор в код платформы, считайте, что </w:t>
+      </w:r>
+      <w:proofErr w:type="spellStart"/>
+      <w:r>
+        <w:rPr>
+          <w:rFonts w:ascii="Bahnschrift" w:hAnsi="Bahnschrift"/>
+          <w:sz w:val="28"/>
+          <w:szCs w:val="28"/>
+          <w:lang w:eastAsia="ru-RU"/>
+        </w:rPr>
+        <w:t>платформозависимая</w:t>
+      </w:r>
+      <w:proofErr w:type="spellEnd"/>
+      <w:r>
+        <w:rPr>
+          <w:rFonts w:ascii="Bahnschrift" w:hAnsi="Bahnschrift"/>
+          <w:sz w:val="28"/>
+          <w:szCs w:val="28"/>
+          <w:lang w:eastAsia="ru-RU"/>
+        </w:rPr>
+        <w:t xml:space="preserve"> компиляция.</w:t>
       </w:r>
     </w:p>
     <w:p>
@@ -4200,6 +4420,7 @@
                 <w:lang w:val="en-US" w:eastAsia="ru-RU"/>
               </w:rPr>
             </w:pPr>
+            <w:proofErr w:type="spellStart"/>
             <w:r>
               <w:rPr>
                 <w:rFonts w:ascii="Bahnschrift" w:hAnsi="Bahnschrift"/>
@@ -4209,6 +4430,7 @@
               </w:rPr>
               <w:t>nirinis</w:t>
             </w:r>
+            <w:proofErr w:type="spellEnd"/>
           </w:p>
         </w:tc>
       </w:tr>
@@ -5780,6 +6002,7 @@
                 <w:lang w:val="en-US" w:eastAsia="ru-RU"/>
               </w:rPr>
             </w:pPr>
+            <w:proofErr w:type="spellStart"/>
             <w:r>
               <w:rPr>
                 <w:rFonts w:ascii="Bahnschrift" w:hAnsi="Bahnschrift"/>
@@ -5788,6 +6011,7 @@
               <w:lastRenderedPageBreak/>
               <w:t>code_size</w:t>
             </w:r>
+            <w:proofErr w:type="spellEnd"/>
           </w:p>
         </w:tc>
         <w:tc>
@@ -5911,6 +6135,7 @@
                 <w:lang w:val="en-US" w:eastAsia="ru-RU"/>
               </w:rPr>
             </w:pPr>
+            <w:proofErr w:type="spellStart"/>
             <w:r>
               <w:rPr>
                 <w:rFonts w:ascii="Bahnschrift" w:hAnsi="Bahnschrift"/>
@@ -5918,6 +6143,7 @@
               </w:rPr>
               <w:t>stack_size</w:t>
             </w:r>
+            <w:proofErr w:type="spellEnd"/>
           </w:p>
         </w:tc>
         <w:tc>
@@ -6301,14 +6527,25 @@
                 <w:lang w:eastAsia="ru-RU"/>
               </w:rPr>
             </w:pPr>
-            <w:r>
-              <w:rPr>
-                <w:rFonts w:ascii="Bahnschrift" w:hAnsi="Bahnschrift"/>
-                <w:sz w:val="28"/>
-                <w:szCs w:val="28"/>
-                <w:lang w:eastAsia="ru-RU"/>
-              </w:rPr>
-              <w:t>Опкод (1 байт)</w:t>
+            <w:proofErr w:type="spellStart"/>
+            <w:r>
+              <w:rPr>
+                <w:rFonts w:ascii="Bahnschrift" w:hAnsi="Bahnschrift"/>
+                <w:sz w:val="28"/>
+                <w:szCs w:val="28"/>
+                <w:lang w:eastAsia="ru-RU"/>
+              </w:rPr>
+              <w:t>Опкод</w:t>
+            </w:r>
+            <w:proofErr w:type="spellEnd"/>
+            <w:r>
+              <w:rPr>
+                <w:rFonts w:ascii="Bahnschrift" w:hAnsi="Bahnschrift"/>
+                <w:sz w:val="28"/>
+                <w:szCs w:val="28"/>
+                <w:lang w:eastAsia="ru-RU"/>
+              </w:rPr>
+              <w:t xml:space="preserve"> (1 байт)</w:t>
             </w:r>
           </w:p>
         </w:tc>
@@ -6375,6 +6612,7 @@
                 <w:lang w:val="en-US" w:eastAsia="ru-RU"/>
               </w:rPr>
             </w:pPr>
+            <w:proofErr w:type="spellStart"/>
             <w:r>
               <w:rPr>
                 <w:rFonts w:ascii="Bahnschrift" w:hAnsi="Bahnschrift"/>
@@ -6384,6 +6622,7 @@
               </w:rPr>
               <w:t>MemoryAddress</w:t>
             </w:r>
+            <w:proofErr w:type="spellEnd"/>
           </w:p>
         </w:tc>
       </w:tr>
@@ -6886,6 +7125,7 @@
                 <w:lang w:eastAsia="ru-RU"/>
               </w:rPr>
             </w:pPr>
+            <w:proofErr w:type="spellStart"/>
             <w:r>
               <w:rPr>
                 <w:rFonts w:ascii="Bahnschrift" w:hAnsi="Bahnschrift"/>
@@ -6895,6 +7135,7 @@
               </w:rPr>
               <w:t>MemoryAddress</w:t>
             </w:r>
+            <w:proofErr w:type="spellEnd"/>
           </w:p>
         </w:tc>
         <w:tc>
@@ -7225,6 +7466,7 @@
                 <w:lang w:eastAsia="ru-RU"/>
               </w:rPr>
             </w:pPr>
+            <w:proofErr w:type="spellStart"/>
             <w:r>
               <w:rPr>
                 <w:rFonts w:ascii="Bahnschrift" w:hAnsi="Bahnschrift"/>
@@ -7234,6 +7476,7 @@
               </w:rPr>
               <w:t>UnhandledSymbol</w:t>
             </w:r>
+            <w:proofErr w:type="spellEnd"/>
           </w:p>
         </w:tc>
         <w:tc>
@@ -8006,6 +8249,7 @@
                 <w:lang w:val="en-US" w:eastAsia="ru-RU"/>
               </w:rPr>
             </w:pPr>
+            <w:proofErr w:type="spellStart"/>
             <w:r>
               <w:rPr>
                 <w:rFonts w:ascii="Bahnschrift" w:hAnsi="Bahnschrift"/>
@@ -8013,6 +8257,7 @@
               </w:rPr>
               <w:t>vm_version</w:t>
             </w:r>
+            <w:proofErr w:type="spellEnd"/>
           </w:p>
         </w:tc>
         <w:tc>
@@ -8136,6 +8381,7 @@
                 <w:lang w:eastAsia="ru-RU"/>
               </w:rPr>
             </w:pPr>
+            <w:proofErr w:type="spellStart"/>
             <w:r>
               <w:rPr>
                 <w:rFonts w:ascii="Bahnschrift" w:hAnsi="Bahnschrift"/>
@@ -8143,6 +8389,7 @@
               </w:rPr>
               <w:t>rod_offset</w:t>
             </w:r>
+            <w:proofErr w:type="spellEnd"/>
           </w:p>
         </w:tc>
         <w:tc>
@@ -8266,6 +8513,7 @@
                 <w:lang w:val="en-US" w:eastAsia="ru-RU"/>
               </w:rPr>
             </w:pPr>
+            <w:proofErr w:type="spellStart"/>
             <w:r>
               <w:rPr>
                 <w:rFonts w:ascii="Bahnschrift" w:hAnsi="Bahnschrift"/>
@@ -8273,6 +8521,7 @@
               </w:rPr>
               <w:t>rod_size</w:t>
             </w:r>
+            <w:proofErr w:type="spellEnd"/>
           </w:p>
         </w:tc>
         <w:tc>
@@ -8424,6 +8673,7 @@
                 <w:lang w:val="en-US" w:eastAsia="ru-RU"/>
               </w:rPr>
             </w:pPr>
+            <w:proofErr w:type="spellStart"/>
             <w:r>
               <w:rPr>
                 <w:rFonts w:ascii="Bahnschrift" w:hAnsi="Bahnschrift"/>
@@ -8431,6 +8681,7 @@
               </w:rPr>
               <w:t>code_offset</w:t>
             </w:r>
+            <w:proofErr w:type="spellEnd"/>
           </w:p>
         </w:tc>
         <w:tc>
@@ -8554,6 +8805,7 @@
                 <w:lang w:eastAsia="ru-RU"/>
               </w:rPr>
             </w:pPr>
+            <w:proofErr w:type="spellStart"/>
             <w:r>
               <w:rPr>
                 <w:rFonts w:ascii="Bahnschrift" w:hAnsi="Bahnschrift"/>
@@ -8561,6 +8813,7 @@
               </w:rPr>
               <w:t>code_size</w:t>
             </w:r>
+            <w:proofErr w:type="spellEnd"/>
           </w:p>
         </w:tc>
         <w:tc>
@@ -8772,6 +9025,7 @@
                 <w:lang w:eastAsia="ru-RU"/>
               </w:rPr>
             </w:pPr>
+            <w:proofErr w:type="spellStart"/>
             <w:r>
               <w:rPr>
                 <w:rFonts w:ascii="Bahnschrift" w:hAnsi="Bahnschrift"/>
@@ -8779,6 +9033,7 @@
               </w:rPr>
               <w:t>rod_offset</w:t>
             </w:r>
+            <w:proofErr w:type="spellEnd"/>
           </w:p>
         </w:tc>
         <w:tc>
@@ -8849,6 +9104,7 @@
               </w:rPr>
               <w:t xml:space="preserve">Команды в формате </w:t>
             </w:r>
+            <w:proofErr w:type="spellStart"/>
             <w:r>
               <w:rPr>
                 <w:rFonts w:ascii="Bahnschrift" w:hAnsi="Bahnschrift"/>
@@ -8856,12 +9112,36 @@
               </w:rPr>
               <w:t>vm</w:t>
             </w:r>
-            <w:r>
-              <w:rPr>
-                <w:rFonts w:ascii="Bahnschrift" w:hAnsi="Bahnschrift"/>
-                <w:lang w:eastAsia="ru-RU"/>
-              </w:rPr>
-              <w:t xml:space="preserve"> (каждая читает по-своему)</w:t>
+            <w:proofErr w:type="spellEnd"/>
+            <w:r>
+              <w:rPr>
+                <w:rFonts w:ascii="Bahnschrift" w:hAnsi="Bahnschrift"/>
+                <w:lang w:eastAsia="ru-RU"/>
+              </w:rPr>
+              <w:t xml:space="preserve"> (каждая</w:t>
+            </w:r>
+            <w:r>
+              <w:rPr>
+                <w:rFonts w:ascii="Bahnschrift" w:hAnsi="Bahnschrift"/>
+                <w:lang w:eastAsia="ru-RU"/>
+              </w:rPr>
+              <w:t xml:space="preserve"> </w:t>
+            </w:r>
+            <w:proofErr w:type="spellStart"/>
+            <w:r>
+              <w:rPr>
+                <w:rFonts w:ascii="Bahnschrift" w:hAnsi="Bahnschrift"/>
+                <w:lang w:val="en-US" w:eastAsia="ru-RU"/>
+              </w:rPr>
+              <w:t>vm</w:t>
+            </w:r>
+            <w:proofErr w:type="spellEnd"/>
+            <w:r>
+              <w:rPr>
+                <w:rFonts w:ascii="Bahnschrift" w:hAnsi="Bahnschrift"/>
+                <w:lang w:eastAsia="ru-RU"/>
+              </w:rPr>
+              <w:t xml:space="preserve"> читает по-своему)</w:t>
             </w:r>
           </w:p>
         </w:tc>
@@ -8922,6 +9202,7 @@
                 <w:lang w:eastAsia="ru-RU"/>
               </w:rPr>
             </w:pPr>
+            <w:proofErr w:type="spellStart"/>
             <w:r>
               <w:rPr>
                 <w:rFonts w:ascii="Bahnschrift" w:hAnsi="Bahnschrift"/>
@@ -8929,6 +9210,7 @@
               </w:rPr>
               <w:t>code_offset</w:t>
             </w:r>
+            <w:proofErr w:type="spellEnd"/>
           </w:p>
         </w:tc>
         <w:tc>
@@ -8991,6 +9273,7 @@
         </w:rPr>
         <w:t xml:space="preserve"> загружаются в память </w:t>
       </w:r>
+      <w:proofErr w:type="spellStart"/>
       <w:r>
         <w:rPr>
           <w:rFonts w:ascii="Bahnschrift" w:hAnsi="Bahnschrift"/>
@@ -9000,6 +9283,7 @@
         </w:rPr>
         <w:t>vm</w:t>
       </w:r>
+      <w:proofErr w:type="spellEnd"/>
       <w:r>
         <w:rPr>
           <w:rFonts w:ascii="Bahnschrift" w:hAnsi="Bahnschrift"/>
@@ -9064,6 +9348,8 @@
         </w:rPr>
         <w:t xml:space="preserve">секцию </w:t>
       </w:r>
+      <w:proofErr w:type="spellStart"/>
+      <w:proofErr w:type="gramStart"/>
       <w:r>
         <w:rPr>
           <w:rFonts w:ascii="Bahnschrift" w:hAnsi="Bahnschrift"/>
@@ -9073,6 +9359,7 @@
         </w:rPr>
         <w:t>memcpy</w:t>
       </w:r>
+      <w:proofErr w:type="spellEnd"/>
       <w:r>
         <w:rPr>
           <w:rFonts w:ascii="Bahnschrift" w:hAnsi="Bahnschrift"/>
@@ -9082,6 +9369,8 @@
         </w:rPr>
         <w:t>(</w:t>
       </w:r>
+      <w:proofErr w:type="spellStart"/>
+      <w:proofErr w:type="gramEnd"/>
       <w:r>
         <w:rPr>
           <w:rFonts w:ascii="Bahnschrift" w:hAnsi="Bahnschrift"/>
@@ -9091,6 +9380,7 @@
         </w:rPr>
         <w:t>dest</w:t>
       </w:r>
+      <w:proofErr w:type="spellEnd"/>
       <w:r>
         <w:rPr>
           <w:rFonts w:ascii="Bahnschrift" w:hAnsi="Bahnschrift"/>
@@ -9100,6 +9390,7 @@
         </w:rPr>
         <w:t>,</w:t>
       </w:r>
+      <w:proofErr w:type="spellStart"/>
       <w:r>
         <w:rPr>
           <w:rFonts w:ascii="Bahnschrift" w:hAnsi="Bahnschrift"/>
@@ -9109,6 +9400,7 @@
         </w:rPr>
         <w:t>src</w:t>
       </w:r>
+      <w:proofErr w:type="spellEnd"/>
       <w:r>
         <w:rPr>
           <w:rFonts w:ascii="Bahnschrift" w:hAnsi="Bahnschrift"/>
@@ -9163,6 +9455,7 @@
         </w:rPr>
         <w:t xml:space="preserve">. Дальше следует загрузить команды с помощью </w:t>
       </w:r>
+      <w:proofErr w:type="spellStart"/>
       <w:r>
         <w:rPr>
           <w:rFonts w:ascii="Bahnschrift" w:hAnsi="Bahnschrift"/>
@@ -9172,6 +9465,7 @@
         </w:rPr>
         <w:t>memcpy</w:t>
       </w:r>
+      <w:proofErr w:type="spellEnd"/>
       <w:r>
         <w:rPr>
           <w:rFonts w:ascii="Bahnschrift" w:hAnsi="Bahnschrift"/>
@@ -9181,6 +9475,8 @@
         </w:rPr>
         <w:t>(</w:t>
       </w:r>
+      <w:proofErr w:type="spellStart"/>
+      <w:proofErr w:type="gramStart"/>
       <w:r>
         <w:rPr>
           <w:rFonts w:ascii="Bahnschrift" w:hAnsi="Bahnschrift"/>
@@ -9190,6 +9486,7 @@
         </w:rPr>
         <w:t>dest</w:t>
       </w:r>
+      <w:proofErr w:type="spellEnd"/>
       <w:r>
         <w:rPr>
           <w:rFonts w:ascii="Bahnschrift" w:hAnsi="Bahnschrift"/>
@@ -9199,6 +9496,7 @@
         </w:rPr>
         <w:t>,</w:t>
       </w:r>
+      <w:proofErr w:type="spellStart"/>
       <w:r>
         <w:rPr>
           <w:rFonts w:ascii="Bahnschrift" w:hAnsi="Bahnschrift"/>
@@ -9208,6 +9506,8 @@
         </w:rPr>
         <w:t>src</w:t>
       </w:r>
+      <w:proofErr w:type="spellEnd"/>
+      <w:proofErr w:type="gramEnd"/>
       <w:r>
         <w:rPr>
           <w:rFonts w:ascii="Bahnschrift" w:hAnsi="Bahnschrift"/>
@@ -9269,8 +9569,29 @@
           <w:szCs w:val="28"/>
           <w:lang w:eastAsia="ru-RU"/>
         </w:rPr>
-        <w:t xml:space="preserve"> Почему используется размер? В случае добавления доп секции не пришлось старым </w:t>
-      </w:r>
+        <w:t xml:space="preserve"> Почему используется размер? В случае добавления </w:t>
+      </w:r>
+      <w:proofErr w:type="spellStart"/>
+      <w:r>
+        <w:rPr>
+          <w:rFonts w:ascii="Bahnschrift" w:hAnsi="Bahnschrift"/>
+          <w:sz w:val="28"/>
+          <w:szCs w:val="28"/>
+          <w:lang w:eastAsia="ru-RU"/>
+        </w:rPr>
+        <w:t>доп</w:t>
+      </w:r>
+      <w:proofErr w:type="spellEnd"/>
+      <w:r>
+        <w:rPr>
+          <w:rFonts w:ascii="Bahnschrift" w:hAnsi="Bahnschrift"/>
+          <w:sz w:val="28"/>
+          <w:szCs w:val="28"/>
+          <w:lang w:eastAsia="ru-RU"/>
+        </w:rPr>
+        <w:t xml:space="preserve"> секции не пришлось старым </w:t>
+      </w:r>
+      <w:proofErr w:type="spellStart"/>
       <w:r>
         <w:rPr>
           <w:rFonts w:ascii="Bahnschrift" w:hAnsi="Bahnschrift"/>
@@ -9280,6 +9601,7 @@
         </w:rPr>
         <w:t>vm</w:t>
       </w:r>
+      <w:proofErr w:type="spellEnd"/>
       <w:r>
         <w:rPr>
           <w:rFonts w:ascii="Bahnschrift" w:hAnsi="Bahnschrift"/>

</xml_diff>

<commit_message>
Broken pipeline is ready... Something wrong is in VM... I need to create disassembler
</commit_message>
<xml_diff>
--- a/Documentation/MSLObjectsStructureRU.docx
+++ b/Documentation/MSLObjectsStructureRU.docx
@@ -386,7 +386,6 @@
         </w:rPr>
         <w:t xml:space="preserve"> </w:t>
       </w:r>
-      <w:proofErr w:type="gramStart"/>
       <w:r>
         <w:rPr>
           <w:rFonts w:ascii="Bahnschrift" w:hAnsi="Bahnschrift"/>
@@ -412,17 +411,7 @@
           <w:szCs w:val="28"/>
           <w:lang w:eastAsia="ru-RU"/>
         </w:rPr>
-        <w:t xml:space="preserve"> и</w:t>
-      </w:r>
-      <w:proofErr w:type="gramEnd"/>
-      <w:r>
-        <w:rPr>
-          <w:rFonts w:ascii="Bahnschrift" w:hAnsi="Bahnschrift"/>
-          <w:sz w:val="28"/>
-          <w:szCs w:val="28"/>
-          <w:lang w:eastAsia="ru-RU"/>
-        </w:rPr>
-        <w:t xml:space="preserve"> </w:t>
+        <w:t xml:space="preserve"> и </w:t>
       </w:r>
       <w:r>
         <w:rPr>
@@ -692,19 +681,8 @@
           <w:szCs w:val="28"/>
           <w:lang w:eastAsia="ru-RU"/>
         </w:rPr>
-        <w:t xml:space="preserve"> порядок обработки </w:t>
-      </w:r>
-      <w:proofErr w:type="gramStart"/>
-      <w:r>
-        <w:rPr>
-          <w:rFonts w:ascii="Bahnschrift" w:hAnsi="Bahnschrift"/>
-          <w:sz w:val="28"/>
-          <w:szCs w:val="28"/>
-          <w:lang w:eastAsia="ru-RU"/>
-        </w:rPr>
-        <w:t>файлов .</w:t>
-      </w:r>
-      <w:proofErr w:type="spellStart"/>
+        <w:t xml:space="preserve"> порядок обработки файлов .</w:t>
+      </w:r>
       <w:r>
         <w:rPr>
           <w:rFonts w:ascii="Bahnschrift" w:hAnsi="Bahnschrift"/>
@@ -714,8 +692,6 @@
         </w:rPr>
         <w:t>mslco</w:t>
       </w:r>
-      <w:proofErr w:type="spellEnd"/>
-      <w:proofErr w:type="gramEnd"/>
       <w:r>
         <w:rPr>
           <w:rFonts w:ascii="Bahnschrift" w:hAnsi="Bahnschrift"/>
@@ -824,25 +800,14 @@
           <w:lang w:eastAsia="ru-RU"/>
         </w:rPr>
       </w:pPr>
-      <w:proofErr w:type="spellStart"/>
-      <w:r>
-        <w:rPr>
-          <w:rFonts w:ascii="Bahnschrift" w:hAnsi="Bahnschrift"/>
-          <w:sz w:val="28"/>
-          <w:szCs w:val="28"/>
-          <w:lang w:eastAsia="ru-RU"/>
-        </w:rPr>
-        <w:t>Дебаг</w:t>
-      </w:r>
-      <w:proofErr w:type="spellEnd"/>
-      <w:r>
-        <w:rPr>
-          <w:rFonts w:ascii="Bahnschrift" w:hAnsi="Bahnschrift"/>
-          <w:sz w:val="28"/>
-          <w:szCs w:val="28"/>
-          <w:lang w:eastAsia="ru-RU"/>
-        </w:rPr>
-        <w:t xml:space="preserve"> информация. На данный момент </w:t>
+      <w:r>
+        <w:rPr>
+          <w:rFonts w:ascii="Bahnschrift" w:hAnsi="Bahnschrift"/>
+          <w:sz w:val="28"/>
+          <w:szCs w:val="28"/>
+          <w:lang w:eastAsia="ru-RU"/>
+        </w:rPr>
+        <w:t xml:space="preserve">Дебаг информация. На данный момент </w:t>
       </w:r>
       <w:r>
         <w:rPr>
@@ -1522,7 +1487,6 @@
                 <w:lang w:eastAsia="ru-RU"/>
               </w:rPr>
             </w:pPr>
-            <w:proofErr w:type="spellStart"/>
             <w:r>
               <w:rPr>
                 <w:rFonts w:ascii="Bahnschrift" w:hAnsi="Bahnschrift"/>
@@ -1530,7 +1494,6 @@
               </w:rPr>
               <w:t>module_file_prefix</w:t>
             </w:r>
-            <w:proofErr w:type="spellEnd"/>
           </w:p>
         </w:tc>
         <w:tc>
@@ -1569,8 +1532,6 @@
                 <w:lang w:val="en-US" w:eastAsia="ru-RU"/>
               </w:rPr>
             </w:pPr>
-            <w:proofErr w:type="spellStart"/>
-            <w:proofErr w:type="gramStart"/>
             <w:r>
               <w:rPr>
                 <w:rFonts w:ascii="Bahnschrift" w:hAnsi="Bahnschrift"/>
@@ -1578,8 +1539,6 @@
               </w:rPr>
               <w:t>module.mslco</w:t>
             </w:r>
-            <w:proofErr w:type="spellEnd"/>
-            <w:proofErr w:type="gramEnd"/>
           </w:p>
         </w:tc>
         <w:tc>
@@ -1600,23 +1559,7 @@
                 <w:rFonts w:ascii="Bahnschrift" w:hAnsi="Bahnschrift"/>
                 <w:lang w:val="en-US" w:eastAsia="ru-RU"/>
               </w:rPr>
-              <w:t>“</w:t>
-            </w:r>
-            <w:proofErr w:type="spellStart"/>
-            <w:r>
-              <w:rPr>
-                <w:rFonts w:ascii="Bahnschrift" w:hAnsi="Bahnschrift"/>
-                <w:lang w:val="en-US" w:eastAsia="ru-RU"/>
-              </w:rPr>
-              <w:t>mslmodule</w:t>
-            </w:r>
-            <w:proofErr w:type="spellEnd"/>
-            <w:r>
-              <w:rPr>
-                <w:rFonts w:ascii="Bahnschrift" w:hAnsi="Bahnschrift"/>
-                <w:lang w:val="en-US" w:eastAsia="ru-RU"/>
-              </w:rPr>
-              <w:t>”</w:t>
+              <w:t>“mslmodule”</w:t>
             </w:r>
           </w:p>
         </w:tc>
@@ -1695,7 +1638,6 @@
                 <w:lang w:eastAsia="ru-RU"/>
               </w:rPr>
             </w:pPr>
-            <w:proofErr w:type="spellStart"/>
             <w:r>
               <w:rPr>
                 <w:rFonts w:ascii="Bahnschrift" w:hAnsi="Bahnschrift"/>
@@ -1710,7 +1652,6 @@
               </w:rPr>
               <w:t>extension</w:t>
             </w:r>
-            <w:proofErr w:type="spellEnd"/>
           </w:p>
         </w:tc>
         <w:tc>
@@ -1753,23 +1694,7 @@
                 <w:rFonts w:ascii="Bahnschrift" w:hAnsi="Bahnschrift"/>
                 <w:lang w:val="en-US" w:eastAsia="ru-RU"/>
               </w:rPr>
-              <w:t>“</w:t>
-            </w:r>
-            <w:proofErr w:type="spellStart"/>
-            <w:r>
-              <w:rPr>
-                <w:rFonts w:ascii="Bahnschrift" w:hAnsi="Bahnschrift"/>
-                <w:lang w:val="en-US" w:eastAsia="ru-RU"/>
-              </w:rPr>
-              <w:t>mslco</w:t>
-            </w:r>
-            <w:proofErr w:type="spellEnd"/>
-            <w:r>
-              <w:rPr>
-                <w:rFonts w:ascii="Bahnschrift" w:hAnsi="Bahnschrift"/>
-                <w:lang w:val="en-US" w:eastAsia="ru-RU"/>
-              </w:rPr>
-              <w:t>”</w:t>
+              <w:t>“mslco”</w:t>
             </w:r>
           </w:p>
         </w:tc>
@@ -1848,7 +1773,6 @@
                 <w:lang w:val="en-US" w:eastAsia="ru-RU"/>
               </w:rPr>
             </w:pPr>
-            <w:proofErr w:type="spellStart"/>
             <w:r>
               <w:rPr>
                 <w:rFonts w:ascii="Bahnschrift" w:hAnsi="Bahnschrift"/>
@@ -1856,7 +1780,6 @@
               </w:rPr>
               <w:t>loi_section</w:t>
             </w:r>
-            <w:proofErr w:type="spellEnd"/>
           </w:p>
         </w:tc>
         <w:tc>
@@ -1872,7 +1795,6 @@
                 <w:lang w:eastAsia="ru-RU"/>
               </w:rPr>
             </w:pPr>
-            <w:proofErr w:type="spellStart"/>
             <w:r>
               <w:rPr>
                 <w:rFonts w:ascii="Bahnschrift" w:hAnsi="Bahnschrift"/>
@@ -1880,7 +1802,6 @@
               </w:rPr>
               <w:t>LinkingOrder</w:t>
             </w:r>
-            <w:proofErr w:type="spellEnd"/>
             <w:r>
               <w:rPr>
                 <w:rFonts w:ascii="Bahnschrift" w:hAnsi="Bahnschrift"/>
@@ -2023,7 +1944,6 @@
                 <w:lang w:val="en-US" w:eastAsia="ru-RU"/>
               </w:rPr>
             </w:pPr>
-            <w:proofErr w:type="spellStart"/>
             <w:r>
               <w:rPr>
                 <w:rFonts w:ascii="Bahnschrift" w:hAnsi="Bahnschrift"/>
@@ -2031,7 +1951,6 @@
               </w:rPr>
               <w:t>ci_section</w:t>
             </w:r>
-            <w:proofErr w:type="spellEnd"/>
           </w:p>
         </w:tc>
         <w:tc>
@@ -2161,7 +2080,6 @@
                 <w:lang w:val="en-US" w:eastAsia="ru-RU"/>
               </w:rPr>
             </w:pPr>
-            <w:proofErr w:type="spellStart"/>
             <w:r>
               <w:rPr>
                 <w:rFonts w:ascii="Bahnschrift" w:hAnsi="Bahnschrift"/>
@@ -2169,7 +2087,6 @@
               </w:rPr>
               <w:t>si_section</w:t>
             </w:r>
-            <w:proofErr w:type="spellEnd"/>
           </w:p>
         </w:tc>
         <w:tc>
@@ -2299,7 +2216,6 @@
                 <w:lang w:val="en-US" w:eastAsia="ru-RU"/>
               </w:rPr>
             </w:pPr>
-            <w:proofErr w:type="spellStart"/>
             <w:r>
               <w:rPr>
                 <w:rFonts w:ascii="Bahnschrift" w:hAnsi="Bahnschrift"/>
@@ -2307,7 +2223,6 @@
               </w:rPr>
               <w:t>di_section</w:t>
             </w:r>
-            <w:proofErr w:type="spellEnd"/>
           </w:p>
         </w:tc>
         <w:tc>
@@ -2683,7 +2598,6 @@
         </w:rPr>
         <w:t xml:space="preserve"> </w:t>
       </w:r>
-      <w:proofErr w:type="spellStart"/>
       <w:r>
         <w:rPr>
           <w:rFonts w:ascii="Bahnschrift" w:hAnsi="Bahnschrift"/>
@@ -2693,7 +2607,6 @@
         </w:rPr>
         <w:t>linking_order</w:t>
       </w:r>
-      <w:proofErr w:type="spellEnd"/>
     </w:p>
     <w:p>
       <w:pPr>
@@ -2949,25 +2862,14 @@
                 <w:lang w:eastAsia="ru-RU"/>
               </w:rPr>
             </w:pPr>
-            <w:proofErr w:type="gramStart"/>
-            <w:r>
-              <w:rPr>
-                <w:rFonts w:ascii="Bahnschrift" w:hAnsi="Bahnschrift"/>
-                <w:sz w:val="28"/>
-                <w:szCs w:val="28"/>
-                <w:lang w:eastAsia="ru-RU"/>
-              </w:rPr>
-              <w:t>Тип(</w:t>
-            </w:r>
-            <w:proofErr w:type="gramEnd"/>
-            <w:r>
-              <w:rPr>
-                <w:rFonts w:ascii="Bahnschrift" w:hAnsi="Bahnschrift"/>
-                <w:sz w:val="28"/>
-                <w:szCs w:val="28"/>
-                <w:lang w:eastAsia="ru-RU"/>
-              </w:rPr>
-              <w:t>1 байт)</w:t>
+            <w:r>
+              <w:rPr>
+                <w:rFonts w:ascii="Bahnschrift" w:hAnsi="Bahnschrift"/>
+                <w:sz w:val="28"/>
+                <w:szCs w:val="28"/>
+                <w:lang w:eastAsia="ru-RU"/>
+              </w:rPr>
+              <w:t>Тип(1 байт)</w:t>
             </w:r>
           </w:p>
         </w:tc>
@@ -3085,8 +2987,6 @@
                 <w:lang w:val="en-US" w:eastAsia="ru-RU"/>
               </w:rPr>
             </w:pPr>
-            <w:proofErr w:type="spellStart"/>
-            <w:proofErr w:type="gramStart"/>
             <w:r>
               <w:rPr>
                 <w:rFonts w:ascii="Bahnschrift" w:hAnsi="Bahnschrift"/>
@@ -3096,8 +2996,6 @@
               </w:rPr>
               <w:t>data.offset</w:t>
             </w:r>
-            <w:proofErr w:type="spellEnd"/>
-            <w:proofErr w:type="gramEnd"/>
           </w:p>
         </w:tc>
         <w:tc>
@@ -3113,7 +3011,6 @@
                 <w:lang w:val="en-US" w:eastAsia="ru-RU"/>
               </w:rPr>
             </w:pPr>
-            <w:proofErr w:type="spellStart"/>
             <w:r>
               <w:rPr>
                 <w:rFonts w:ascii="Bahnschrift" w:hAnsi="Bahnschrift"/>
@@ -3123,7 +3020,6 @@
               </w:rPr>
               <w:t>lsize</w:t>
             </w:r>
-            <w:proofErr w:type="spellEnd"/>
           </w:p>
         </w:tc>
       </w:tr>
@@ -3192,19 +3088,24 @@
                 <w:lang w:val="en-US" w:eastAsia="ru-RU"/>
               </w:rPr>
             </w:pPr>
-            <w:proofErr w:type="spellStart"/>
-            <w:proofErr w:type="gramStart"/>
-            <w:r>
-              <w:rPr>
-                <w:rFonts w:ascii="Bahnschrift" w:hAnsi="Bahnschrift"/>
-                <w:sz w:val="28"/>
-                <w:szCs w:val="28"/>
-                <w:lang w:val="en-US" w:eastAsia="ru-RU"/>
-              </w:rPr>
-              <w:t>data.offset</w:t>
-            </w:r>
-            <w:proofErr w:type="spellEnd"/>
-            <w:proofErr w:type="gramEnd"/>
+            <w:r>
+              <w:rPr>
+                <w:rFonts w:ascii="Bahnschrift" w:hAnsi="Bahnschrift"/>
+                <w:sz w:val="28"/>
+                <w:szCs w:val="28"/>
+                <w:lang w:val="en-US" w:eastAsia="ru-RU"/>
+              </w:rPr>
+              <w:t xml:space="preserve">data.offset </w:t>
+            </w:r>
+            <w:r>
+              <w:rPr>
+                <w:rFonts w:ascii="Bahnschrift" w:hAnsi="Bahnschrift"/>
+                <w:sz w:val="28"/>
+                <w:szCs w:val="28"/>
+                <w:lang w:val="en-US" w:eastAsia="ru-RU"/>
+              </w:rPr>
+              <w:t>+</w:t>
+            </w:r>
             <w:r>
               <w:rPr>
                 <w:rFonts w:ascii="Bahnschrift" w:hAnsi="Bahnschrift"/>
@@ -3221,28 +3122,8 @@
                 <w:szCs w:val="28"/>
                 <w:lang w:val="en-US" w:eastAsia="ru-RU"/>
               </w:rPr>
-              <w:t>+</w:t>
-            </w:r>
-            <w:r>
-              <w:rPr>
-                <w:rFonts w:ascii="Bahnschrift" w:hAnsi="Bahnschrift"/>
-                <w:sz w:val="28"/>
-                <w:szCs w:val="28"/>
-                <w:lang w:val="en-US" w:eastAsia="ru-RU"/>
-              </w:rPr>
-              <w:t xml:space="preserve"> </w:t>
-            </w:r>
-            <w:proofErr w:type="spellStart"/>
-            <w:r>
-              <w:rPr>
-                <w:rFonts w:ascii="Bahnschrift" w:hAnsi="Bahnschrift"/>
-                <w:sz w:val="28"/>
-                <w:szCs w:val="28"/>
-                <w:lang w:val="en-US" w:eastAsia="ru-RU"/>
-              </w:rPr>
               <w:t>lsize</w:t>
             </w:r>
-            <w:proofErr w:type="spellEnd"/>
           </w:p>
         </w:tc>
         <w:tc>
@@ -3258,7 +3139,6 @@
                 <w:lang w:val="en-US" w:eastAsia="ru-RU"/>
               </w:rPr>
             </w:pPr>
-            <w:proofErr w:type="spellStart"/>
             <w:r>
               <w:rPr>
                 <w:rFonts w:ascii="Bahnschrift" w:hAnsi="Bahnschrift"/>
@@ -3268,7 +3148,6 @@
               </w:rPr>
               <w:t>csize</w:t>
             </w:r>
-            <w:proofErr w:type="spellEnd"/>
           </w:p>
         </w:tc>
       </w:tr>
@@ -3337,19 +3216,24 @@
                 <w:lang w:eastAsia="ru-RU"/>
               </w:rPr>
             </w:pPr>
-            <w:proofErr w:type="spellStart"/>
-            <w:proofErr w:type="gramStart"/>
-            <w:r>
-              <w:rPr>
-                <w:rFonts w:ascii="Bahnschrift" w:hAnsi="Bahnschrift"/>
-                <w:sz w:val="28"/>
-                <w:szCs w:val="28"/>
-                <w:lang w:val="en-US" w:eastAsia="ru-RU"/>
-              </w:rPr>
-              <w:t>data.offset</w:t>
-            </w:r>
-            <w:proofErr w:type="spellEnd"/>
-            <w:proofErr w:type="gramEnd"/>
+            <w:r>
+              <w:rPr>
+                <w:rFonts w:ascii="Bahnschrift" w:hAnsi="Bahnschrift"/>
+                <w:sz w:val="28"/>
+                <w:szCs w:val="28"/>
+                <w:lang w:val="en-US" w:eastAsia="ru-RU"/>
+              </w:rPr>
+              <w:t xml:space="preserve">data.offset </w:t>
+            </w:r>
+            <w:r>
+              <w:rPr>
+                <w:rFonts w:ascii="Bahnschrift" w:hAnsi="Bahnschrift"/>
+                <w:sz w:val="28"/>
+                <w:szCs w:val="28"/>
+                <w:lang w:val="en-US" w:eastAsia="ru-RU"/>
+              </w:rPr>
+              <w:t>+</w:t>
+            </w:r>
             <w:r>
               <w:rPr>
                 <w:rFonts w:ascii="Bahnschrift" w:hAnsi="Bahnschrift"/>
@@ -3366,6 +3250,24 @@
                 <w:szCs w:val="28"/>
                 <w:lang w:val="en-US" w:eastAsia="ru-RU"/>
               </w:rPr>
+              <w:t>lsize</w:t>
+            </w:r>
+            <w:r>
+              <w:rPr>
+                <w:rFonts w:ascii="Bahnschrift" w:hAnsi="Bahnschrift"/>
+                <w:sz w:val="28"/>
+                <w:szCs w:val="28"/>
+                <w:lang w:val="en-US" w:eastAsia="ru-RU"/>
+              </w:rPr>
+              <w:t xml:space="preserve"> </w:t>
+            </w:r>
+            <w:r>
+              <w:rPr>
+                <w:rFonts w:ascii="Bahnschrift" w:hAnsi="Bahnschrift"/>
+                <w:sz w:val="28"/>
+                <w:szCs w:val="28"/>
+                <w:lang w:val="en-US" w:eastAsia="ru-RU"/>
+              </w:rPr>
               <w:t>+</w:t>
             </w:r>
             <w:r>
@@ -3377,45 +3279,6 @@
               </w:rPr>
               <w:t xml:space="preserve"> </w:t>
             </w:r>
-            <w:proofErr w:type="spellStart"/>
-            <w:r>
-              <w:rPr>
-                <w:rFonts w:ascii="Bahnschrift" w:hAnsi="Bahnschrift"/>
-                <w:sz w:val="28"/>
-                <w:szCs w:val="28"/>
-                <w:lang w:val="en-US" w:eastAsia="ru-RU"/>
-              </w:rPr>
-              <w:t>lsize</w:t>
-            </w:r>
-            <w:proofErr w:type="spellEnd"/>
-            <w:r>
-              <w:rPr>
-                <w:rFonts w:ascii="Bahnschrift" w:hAnsi="Bahnschrift"/>
-                <w:sz w:val="28"/>
-                <w:szCs w:val="28"/>
-                <w:lang w:val="en-US" w:eastAsia="ru-RU"/>
-              </w:rPr>
-              <w:t xml:space="preserve"> </w:t>
-            </w:r>
-            <w:r>
-              <w:rPr>
-                <w:rFonts w:ascii="Bahnschrift" w:hAnsi="Bahnschrift"/>
-                <w:sz w:val="28"/>
-                <w:szCs w:val="28"/>
-                <w:lang w:val="en-US" w:eastAsia="ru-RU"/>
-              </w:rPr>
-              <w:t>+</w:t>
-            </w:r>
-            <w:r>
-              <w:rPr>
-                <w:rFonts w:ascii="Bahnschrift" w:hAnsi="Bahnschrift"/>
-                <w:sz w:val="28"/>
-                <w:szCs w:val="28"/>
-                <w:lang w:val="en-US" w:eastAsia="ru-RU"/>
-              </w:rPr>
-              <w:t xml:space="preserve"> </w:t>
-            </w:r>
-            <w:proofErr w:type="spellStart"/>
             <w:r>
               <w:rPr>
                 <w:rFonts w:ascii="Bahnschrift" w:hAnsi="Bahnschrift"/>
@@ -3425,7 +3288,6 @@
               </w:rPr>
               <w:t>csize</w:t>
             </w:r>
-            <w:proofErr w:type="spellEnd"/>
           </w:p>
         </w:tc>
         <w:tc>
@@ -3441,7 +3303,6 @@
                 <w:lang w:val="en-US" w:eastAsia="ru-RU"/>
               </w:rPr>
             </w:pPr>
-            <w:proofErr w:type="spellStart"/>
             <w:r>
               <w:rPr>
                 <w:rFonts w:ascii="Bahnschrift" w:hAnsi="Bahnschrift"/>
@@ -3451,7 +3312,6 @@
               </w:rPr>
               <w:t>ssize</w:t>
             </w:r>
-            <w:proofErr w:type="spellEnd"/>
           </w:p>
         </w:tc>
       </w:tr>
@@ -3520,19 +3380,24 @@
                 <w:lang w:val="en-US" w:eastAsia="ru-RU"/>
               </w:rPr>
             </w:pPr>
-            <w:proofErr w:type="spellStart"/>
-            <w:proofErr w:type="gramStart"/>
-            <w:r>
-              <w:rPr>
-                <w:rFonts w:ascii="Bahnschrift" w:hAnsi="Bahnschrift"/>
-                <w:sz w:val="28"/>
-                <w:szCs w:val="28"/>
-                <w:lang w:val="en-US" w:eastAsia="ru-RU"/>
-              </w:rPr>
-              <w:t>data.offset</w:t>
-            </w:r>
-            <w:proofErr w:type="spellEnd"/>
-            <w:proofErr w:type="gramEnd"/>
+            <w:r>
+              <w:rPr>
+                <w:rFonts w:ascii="Bahnschrift" w:hAnsi="Bahnschrift"/>
+                <w:sz w:val="28"/>
+                <w:szCs w:val="28"/>
+                <w:lang w:val="en-US" w:eastAsia="ru-RU"/>
+              </w:rPr>
+              <w:t xml:space="preserve">data.offset </w:t>
+            </w:r>
+            <w:r>
+              <w:rPr>
+                <w:rFonts w:ascii="Bahnschrift" w:hAnsi="Bahnschrift"/>
+                <w:sz w:val="28"/>
+                <w:szCs w:val="28"/>
+                <w:lang w:val="en-US" w:eastAsia="ru-RU"/>
+              </w:rPr>
+              <w:t>+</w:t>
+            </w:r>
             <w:r>
               <w:rPr>
                 <w:rFonts w:ascii="Bahnschrift" w:hAnsi="Bahnschrift"/>
@@ -3549,6 +3414,24 @@
                 <w:szCs w:val="28"/>
                 <w:lang w:val="en-US" w:eastAsia="ru-RU"/>
               </w:rPr>
+              <w:t>lsize</w:t>
+            </w:r>
+            <w:r>
+              <w:rPr>
+                <w:rFonts w:ascii="Bahnschrift" w:hAnsi="Bahnschrift"/>
+                <w:sz w:val="28"/>
+                <w:szCs w:val="28"/>
+                <w:lang w:val="en-US" w:eastAsia="ru-RU"/>
+              </w:rPr>
+              <w:t xml:space="preserve"> </w:t>
+            </w:r>
+            <w:r>
+              <w:rPr>
+                <w:rFonts w:ascii="Bahnschrift" w:hAnsi="Bahnschrift"/>
+                <w:sz w:val="28"/>
+                <w:szCs w:val="28"/>
+                <w:lang w:val="en-US" w:eastAsia="ru-RU"/>
+              </w:rPr>
               <w:t>+</w:t>
             </w:r>
             <w:r>
@@ -3560,17 +3443,15 @@
               </w:rPr>
               <w:t xml:space="preserve"> </w:t>
             </w:r>
-            <w:proofErr w:type="spellStart"/>
-            <w:r>
-              <w:rPr>
-                <w:rFonts w:ascii="Bahnschrift" w:hAnsi="Bahnschrift"/>
-                <w:sz w:val="28"/>
-                <w:szCs w:val="28"/>
-                <w:lang w:val="en-US" w:eastAsia="ru-RU"/>
-              </w:rPr>
-              <w:t>lsize</w:t>
-            </w:r>
-            <w:proofErr w:type="spellEnd"/>
+            <w:r>
+              <w:rPr>
+                <w:rFonts w:ascii="Bahnschrift" w:hAnsi="Bahnschrift"/>
+                <w:sz w:val="28"/>
+                <w:szCs w:val="28"/>
+                <w:lang w:val="en-US" w:eastAsia="ru-RU"/>
+              </w:rPr>
+              <w:t>csize</w:t>
+            </w:r>
             <w:r>
               <w:rPr>
                 <w:rFonts w:ascii="Bahnschrift" w:hAnsi="Bahnschrift"/>
@@ -3598,45 +3479,6 @@
               </w:rPr>
               <w:t xml:space="preserve"> </w:t>
             </w:r>
-            <w:proofErr w:type="spellStart"/>
-            <w:r>
-              <w:rPr>
-                <w:rFonts w:ascii="Bahnschrift" w:hAnsi="Bahnschrift"/>
-                <w:sz w:val="28"/>
-                <w:szCs w:val="28"/>
-                <w:lang w:val="en-US" w:eastAsia="ru-RU"/>
-              </w:rPr>
-              <w:t>csize</w:t>
-            </w:r>
-            <w:proofErr w:type="spellEnd"/>
-            <w:r>
-              <w:rPr>
-                <w:rFonts w:ascii="Bahnschrift" w:hAnsi="Bahnschrift"/>
-                <w:sz w:val="28"/>
-                <w:szCs w:val="28"/>
-                <w:lang w:val="en-US" w:eastAsia="ru-RU"/>
-              </w:rPr>
-              <w:t xml:space="preserve"> </w:t>
-            </w:r>
-            <w:r>
-              <w:rPr>
-                <w:rFonts w:ascii="Bahnschrift" w:hAnsi="Bahnschrift"/>
-                <w:sz w:val="28"/>
-                <w:szCs w:val="28"/>
-                <w:lang w:val="en-US" w:eastAsia="ru-RU"/>
-              </w:rPr>
-              <w:t>+</w:t>
-            </w:r>
-            <w:r>
-              <w:rPr>
-                <w:rFonts w:ascii="Bahnschrift" w:hAnsi="Bahnschrift"/>
-                <w:sz w:val="28"/>
-                <w:szCs w:val="28"/>
-                <w:lang w:val="en-US" w:eastAsia="ru-RU"/>
-              </w:rPr>
-              <w:t xml:space="preserve"> </w:t>
-            </w:r>
-            <w:proofErr w:type="spellStart"/>
             <w:r>
               <w:rPr>
                 <w:rFonts w:ascii="Bahnschrift" w:hAnsi="Bahnschrift"/>
@@ -3646,7 +3488,6 @@
               </w:rPr>
               <w:t>ssize</w:t>
             </w:r>
-            <w:proofErr w:type="spellEnd"/>
           </w:p>
         </w:tc>
         <w:tc>
@@ -3662,7 +3503,6 @@
                 <w:lang w:eastAsia="ru-RU"/>
               </w:rPr>
             </w:pPr>
-            <w:proofErr w:type="spellStart"/>
             <w:r>
               <w:rPr>
                 <w:rFonts w:ascii="Bahnschrift" w:hAnsi="Bahnschrift"/>
@@ -3672,7 +3512,6 @@
               </w:rPr>
               <w:t>dsize</w:t>
             </w:r>
-            <w:proofErr w:type="spellEnd"/>
           </w:p>
         </w:tc>
       </w:tr>
@@ -3787,19 +3626,8 @@
           <w:szCs w:val="28"/>
           <w:lang w:eastAsia="ru-RU"/>
         </w:rPr>
-        <w:t xml:space="preserve">к </w:t>
-      </w:r>
-      <w:proofErr w:type="spellStart"/>
-      <w:r>
-        <w:rPr>
-          <w:rFonts w:ascii="Bahnschrift" w:hAnsi="Bahnschrift"/>
-          <w:sz w:val="28"/>
-          <w:szCs w:val="28"/>
-          <w:lang w:eastAsia="ru-RU"/>
-        </w:rPr>
-        <w:t>module_file_prefix</w:t>
-      </w:r>
-      <w:proofErr w:type="spellEnd"/>
+        <w:t>к module_file_prefix</w:t>
+      </w:r>
       <w:r>
         <w:rPr>
           <w:rFonts w:ascii="Bahnschrift" w:hAnsi="Bahnschrift"/>
@@ -3845,7 +3673,6 @@
         </w:rPr>
         <w:t xml:space="preserve">– это и будет имя файла с кодом, который следует найти и загрузить, например, </w:t>
       </w:r>
-      <w:proofErr w:type="spellStart"/>
       <w:r>
         <w:rPr>
           <w:rFonts w:ascii="Bahnschrift" w:hAnsi="Bahnschrift"/>
@@ -3855,7 +3682,6 @@
         </w:rPr>
         <w:t>mslmodule</w:t>
       </w:r>
-      <w:proofErr w:type="spellEnd"/>
       <w:r>
         <w:rPr>
           <w:rFonts w:ascii="Bahnschrift" w:hAnsi="Bahnschrift"/>
@@ -3874,7 +3700,6 @@
         </w:rPr>
         <w:t>.</w:t>
       </w:r>
-      <w:proofErr w:type="spellStart"/>
       <w:r>
         <w:rPr>
           <w:rFonts w:ascii="Bahnschrift" w:hAnsi="Bahnschrift"/>
@@ -3884,7 +3709,6 @@
         </w:rPr>
         <w:t>mslco</w:t>
       </w:r>
-      <w:proofErr w:type="spellEnd"/>
       <w:r>
         <w:rPr>
           <w:rFonts w:ascii="Bahnschrift" w:hAnsi="Bahnschrift"/>
@@ -3903,7 +3727,6 @@
         </w:rPr>
         <w:t xml:space="preserve"> </w:t>
       </w:r>
-      <w:proofErr w:type="spellStart"/>
       <w:r>
         <w:rPr>
           <w:rFonts w:ascii="Bahnschrift" w:hAnsi="Bahnschrift"/>
@@ -3913,7 +3736,6 @@
         </w:rPr>
         <w:t>mslmodule</w:t>
       </w:r>
-      <w:proofErr w:type="spellEnd"/>
       <w:r>
         <w:rPr>
           <w:rFonts w:ascii="Bahnschrift" w:hAnsi="Bahnschrift"/>
@@ -3923,7 +3745,6 @@
         </w:rPr>
         <w:t>1.</w:t>
       </w:r>
-      <w:proofErr w:type="spellStart"/>
       <w:r>
         <w:rPr>
           <w:rFonts w:ascii="Bahnschrift" w:hAnsi="Bahnschrift"/>
@@ -3933,35 +3754,14 @@
         </w:rPr>
         <w:t>mslco</w:t>
       </w:r>
-      <w:proofErr w:type="spellEnd"/>
-      <w:r>
-        <w:rPr>
-          <w:rFonts w:ascii="Bahnschrift" w:hAnsi="Bahnschrift"/>
-          <w:sz w:val="28"/>
-          <w:szCs w:val="28"/>
-          <w:lang w:eastAsia="ru-RU"/>
-        </w:rPr>
-        <w:t xml:space="preserve"> и </w:t>
-      </w:r>
-      <w:proofErr w:type="spellStart"/>
-      <w:r>
-        <w:rPr>
-          <w:rFonts w:ascii="Bahnschrift" w:hAnsi="Bahnschrift"/>
-          <w:sz w:val="28"/>
-          <w:szCs w:val="28"/>
-          <w:lang w:eastAsia="ru-RU"/>
-        </w:rPr>
-        <w:t>тд</w:t>
-      </w:r>
-      <w:proofErr w:type="spellEnd"/>
-      <w:r>
-        <w:rPr>
-          <w:rFonts w:ascii="Bahnschrift" w:hAnsi="Bahnschrift"/>
-          <w:sz w:val="28"/>
-          <w:szCs w:val="28"/>
-          <w:lang w:eastAsia="ru-RU"/>
-        </w:rPr>
-        <w:t>.</w:t>
+      <w:r>
+        <w:rPr>
+          <w:rFonts w:ascii="Bahnschrift" w:hAnsi="Bahnschrift"/>
+          <w:sz w:val="28"/>
+          <w:szCs w:val="28"/>
+          <w:lang w:eastAsia="ru-RU"/>
+        </w:rPr>
+        <w:t xml:space="preserve"> и тд.</w:t>
       </w:r>
       <w:r>
         <w:rPr>
@@ -4087,27 +3887,7 @@
           <w:szCs w:val="28"/>
           <w:lang w:eastAsia="ru-RU"/>
         </w:rPr>
-        <w:t xml:space="preserve"> сторонний линкер не просто склейщик кода, а ещё и своеобразный транслятор в код платформы, считайте, что </w:t>
-      </w:r>
-      <w:proofErr w:type="spellStart"/>
-      <w:r>
-        <w:rPr>
-          <w:rFonts w:ascii="Bahnschrift" w:hAnsi="Bahnschrift"/>
-          <w:sz w:val="28"/>
-          <w:szCs w:val="28"/>
-          <w:lang w:eastAsia="ru-RU"/>
-        </w:rPr>
-        <w:t>платформозависимая</w:t>
-      </w:r>
-      <w:proofErr w:type="spellEnd"/>
-      <w:r>
-        <w:rPr>
-          <w:rFonts w:ascii="Bahnschrift" w:hAnsi="Bahnschrift"/>
-          <w:sz w:val="28"/>
-          <w:szCs w:val="28"/>
-          <w:lang w:eastAsia="ru-RU"/>
-        </w:rPr>
-        <w:t xml:space="preserve"> компиляция.</w:t>
+        <w:t xml:space="preserve"> сторонний линкер не просто склейщик кода, а ещё и своеобразный транслятор в код платформы, считайте, что платформозависимая компиляция.</w:t>
       </w:r>
     </w:p>
     <w:p>
@@ -4420,7 +4200,6 @@
                 <w:lang w:val="en-US" w:eastAsia="ru-RU"/>
               </w:rPr>
             </w:pPr>
-            <w:proofErr w:type="spellStart"/>
             <w:r>
               <w:rPr>
                 <w:rFonts w:ascii="Bahnschrift" w:hAnsi="Bahnschrift"/>
@@ -4430,7 +4209,6 @@
               </w:rPr>
               <w:t>nirinis</w:t>
             </w:r>
-            <w:proofErr w:type="spellEnd"/>
           </w:p>
         </w:tc>
       </w:tr>
@@ -6002,7 +5780,6 @@
                 <w:lang w:val="en-US" w:eastAsia="ru-RU"/>
               </w:rPr>
             </w:pPr>
-            <w:proofErr w:type="spellStart"/>
             <w:r>
               <w:rPr>
                 <w:rFonts w:ascii="Bahnschrift" w:hAnsi="Bahnschrift"/>
@@ -6011,7 +5788,6 @@
               <w:lastRenderedPageBreak/>
               <w:t>code_size</w:t>
             </w:r>
-            <w:proofErr w:type="spellEnd"/>
           </w:p>
         </w:tc>
         <w:tc>
@@ -6135,7 +5911,6 @@
                 <w:lang w:val="en-US" w:eastAsia="ru-RU"/>
               </w:rPr>
             </w:pPr>
-            <w:proofErr w:type="spellStart"/>
             <w:r>
               <w:rPr>
                 <w:rFonts w:ascii="Bahnschrift" w:hAnsi="Bahnschrift"/>
@@ -6143,7 +5918,6 @@
               </w:rPr>
               <w:t>stack_size</w:t>
             </w:r>
-            <w:proofErr w:type="spellEnd"/>
           </w:p>
         </w:tc>
         <w:tc>
@@ -6527,25 +6301,14 @@
                 <w:lang w:eastAsia="ru-RU"/>
               </w:rPr>
             </w:pPr>
-            <w:proofErr w:type="spellStart"/>
-            <w:r>
-              <w:rPr>
-                <w:rFonts w:ascii="Bahnschrift" w:hAnsi="Bahnschrift"/>
-                <w:sz w:val="28"/>
-                <w:szCs w:val="28"/>
-                <w:lang w:eastAsia="ru-RU"/>
-              </w:rPr>
-              <w:t>Опкод</w:t>
-            </w:r>
-            <w:proofErr w:type="spellEnd"/>
-            <w:r>
-              <w:rPr>
-                <w:rFonts w:ascii="Bahnschrift" w:hAnsi="Bahnschrift"/>
-                <w:sz w:val="28"/>
-                <w:szCs w:val="28"/>
-                <w:lang w:eastAsia="ru-RU"/>
-              </w:rPr>
-              <w:t xml:space="preserve"> (1 байт)</w:t>
+            <w:r>
+              <w:rPr>
+                <w:rFonts w:ascii="Bahnschrift" w:hAnsi="Bahnschrift"/>
+                <w:sz w:val="28"/>
+                <w:szCs w:val="28"/>
+                <w:lang w:eastAsia="ru-RU"/>
+              </w:rPr>
+              <w:t>Опкод (1 байт)</w:t>
             </w:r>
           </w:p>
         </w:tc>
@@ -6612,7 +6375,6 @@
                 <w:lang w:val="en-US" w:eastAsia="ru-RU"/>
               </w:rPr>
             </w:pPr>
-            <w:proofErr w:type="spellStart"/>
             <w:r>
               <w:rPr>
                 <w:rFonts w:ascii="Bahnschrift" w:hAnsi="Bahnschrift"/>
@@ -6622,7 +6384,6 @@
               </w:rPr>
               <w:t>MemoryAddress</w:t>
             </w:r>
-            <w:proofErr w:type="spellEnd"/>
           </w:p>
         </w:tc>
       </w:tr>
@@ -7125,7 +6886,6 @@
                 <w:lang w:eastAsia="ru-RU"/>
               </w:rPr>
             </w:pPr>
-            <w:proofErr w:type="spellStart"/>
             <w:r>
               <w:rPr>
                 <w:rFonts w:ascii="Bahnschrift" w:hAnsi="Bahnschrift"/>
@@ -7135,7 +6895,6 @@
               </w:rPr>
               <w:t>MemoryAddress</w:t>
             </w:r>
-            <w:proofErr w:type="spellEnd"/>
           </w:p>
         </w:tc>
         <w:tc>
@@ -7466,7 +7225,6 @@
                 <w:lang w:eastAsia="ru-RU"/>
               </w:rPr>
             </w:pPr>
-            <w:proofErr w:type="spellStart"/>
             <w:r>
               <w:rPr>
                 <w:rFonts w:ascii="Bahnschrift" w:hAnsi="Bahnschrift"/>
@@ -7476,7 +7234,6 @@
               </w:rPr>
               <w:t>UnhandledSymbol</w:t>
             </w:r>
-            <w:proofErr w:type="spellEnd"/>
           </w:p>
         </w:tc>
         <w:tc>
@@ -8249,7 +8006,6 @@
                 <w:lang w:val="en-US" w:eastAsia="ru-RU"/>
               </w:rPr>
             </w:pPr>
-            <w:proofErr w:type="spellStart"/>
             <w:r>
               <w:rPr>
                 <w:rFonts w:ascii="Bahnschrift" w:hAnsi="Bahnschrift"/>
@@ -8257,7 +8013,6 @@
               </w:rPr>
               <w:t>vm_version</w:t>
             </w:r>
-            <w:proofErr w:type="spellEnd"/>
           </w:p>
         </w:tc>
         <w:tc>
@@ -8381,7 +8136,6 @@
                 <w:lang w:eastAsia="ru-RU"/>
               </w:rPr>
             </w:pPr>
-            <w:proofErr w:type="spellStart"/>
             <w:r>
               <w:rPr>
                 <w:rFonts w:ascii="Bahnschrift" w:hAnsi="Bahnschrift"/>
@@ -8389,7 +8143,6 @@
               </w:rPr>
               <w:t>rod_offset</w:t>
             </w:r>
-            <w:proofErr w:type="spellEnd"/>
           </w:p>
         </w:tc>
         <w:tc>
@@ -8513,7 +8266,6 @@
                 <w:lang w:val="en-US" w:eastAsia="ru-RU"/>
               </w:rPr>
             </w:pPr>
-            <w:proofErr w:type="spellStart"/>
             <w:r>
               <w:rPr>
                 <w:rFonts w:ascii="Bahnschrift" w:hAnsi="Bahnschrift"/>
@@ -8521,7 +8273,6 @@
               </w:rPr>
               <w:t>rod_size</w:t>
             </w:r>
-            <w:proofErr w:type="spellEnd"/>
           </w:p>
         </w:tc>
         <w:tc>
@@ -8673,7 +8424,6 @@
                 <w:lang w:val="en-US" w:eastAsia="ru-RU"/>
               </w:rPr>
             </w:pPr>
-            <w:proofErr w:type="spellStart"/>
             <w:r>
               <w:rPr>
                 <w:rFonts w:ascii="Bahnschrift" w:hAnsi="Bahnschrift"/>
@@ -8681,7 +8431,6 @@
               </w:rPr>
               <w:t>code_offset</w:t>
             </w:r>
-            <w:proofErr w:type="spellEnd"/>
           </w:p>
         </w:tc>
         <w:tc>
@@ -8805,7 +8554,6 @@
                 <w:lang w:eastAsia="ru-RU"/>
               </w:rPr>
             </w:pPr>
-            <w:proofErr w:type="spellStart"/>
             <w:r>
               <w:rPr>
                 <w:rFonts w:ascii="Bahnschrift" w:hAnsi="Bahnschrift"/>
@@ -8813,7 +8561,6 @@
               </w:rPr>
               <w:t>code_size</w:t>
             </w:r>
-            <w:proofErr w:type="spellEnd"/>
           </w:p>
         </w:tc>
         <w:tc>
@@ -9025,7 +8772,6 @@
                 <w:lang w:eastAsia="ru-RU"/>
               </w:rPr>
             </w:pPr>
-            <w:proofErr w:type="spellStart"/>
             <w:r>
               <w:rPr>
                 <w:rFonts w:ascii="Bahnschrift" w:hAnsi="Bahnschrift"/>
@@ -9033,7 +8779,6 @@
               </w:rPr>
               <w:t>rod_offset</w:t>
             </w:r>
-            <w:proofErr w:type="spellEnd"/>
           </w:p>
         </w:tc>
         <w:tc>
@@ -9104,7 +8849,6 @@
               </w:rPr>
               <w:t xml:space="preserve">Команды в формате </w:t>
             </w:r>
-            <w:proofErr w:type="spellStart"/>
             <w:r>
               <w:rPr>
                 <w:rFonts w:ascii="Bahnschrift" w:hAnsi="Bahnschrift"/>
@@ -9112,7 +8856,6 @@
               </w:rPr>
               <w:t>vm</w:t>
             </w:r>
-            <w:proofErr w:type="spellEnd"/>
             <w:r>
               <w:rPr>
                 <w:rFonts w:ascii="Bahnschrift" w:hAnsi="Bahnschrift"/>
@@ -9127,7 +8870,6 @@
               </w:rPr>
               <w:t xml:space="preserve"> </w:t>
             </w:r>
-            <w:proofErr w:type="spellStart"/>
             <w:r>
               <w:rPr>
                 <w:rFonts w:ascii="Bahnschrift" w:hAnsi="Bahnschrift"/>
@@ -9135,7 +8877,6 @@
               </w:rPr>
               <w:t>vm</w:t>
             </w:r>
-            <w:proofErr w:type="spellEnd"/>
             <w:r>
               <w:rPr>
                 <w:rFonts w:ascii="Bahnschrift" w:hAnsi="Bahnschrift"/>
@@ -9202,7 +8943,6 @@
                 <w:lang w:eastAsia="ru-RU"/>
               </w:rPr>
             </w:pPr>
-            <w:proofErr w:type="spellStart"/>
             <w:r>
               <w:rPr>
                 <w:rFonts w:ascii="Bahnschrift" w:hAnsi="Bahnschrift"/>
@@ -9210,7 +8950,6 @@
               </w:rPr>
               <w:t>code_offset</w:t>
             </w:r>
-            <w:proofErr w:type="spellEnd"/>
           </w:p>
         </w:tc>
         <w:tc>
@@ -9273,7 +9012,6 @@
         </w:rPr>
         <w:t xml:space="preserve"> загружаются в память </w:t>
       </w:r>
-      <w:proofErr w:type="spellStart"/>
       <w:r>
         <w:rPr>
           <w:rFonts w:ascii="Bahnschrift" w:hAnsi="Bahnschrift"/>
@@ -9283,7 +9021,6 @@
         </w:rPr>
         <w:t>vm</w:t>
       </w:r>
-      <w:proofErr w:type="spellEnd"/>
       <w:r>
         <w:rPr>
           <w:rFonts w:ascii="Bahnschrift" w:hAnsi="Bahnschrift"/>
@@ -9292,6 +9029,42 @@
           <w:lang w:eastAsia="ru-RU"/>
         </w:rPr>
         <w:t xml:space="preserve"> при загрузке скрипта, после чего их изменение запрещено.</w:t>
+      </w:r>
+      <w:r>
+        <w:rPr>
+          <w:rFonts w:ascii="Bahnschrift" w:hAnsi="Bahnschrift"/>
+          <w:sz w:val="28"/>
+          <w:szCs w:val="28"/>
+          <w:lang w:eastAsia="ru-RU"/>
+        </w:rPr>
+        <w:t xml:space="preserve"> </w:t>
+      </w:r>
+      <w:r>
+        <w:rPr>
+          <w:rFonts w:ascii="Bahnschrift" w:hAnsi="Bahnschrift"/>
+          <w:sz w:val="28"/>
+          <w:szCs w:val="28"/>
+          <w:lang w:eastAsia="ru-RU"/>
+        </w:rPr>
+        <w:t xml:space="preserve">Под заголовок зарезервировано 100 байт (в нынешнем линкере ). </w:t>
+      </w:r>
+      <w:r>
+        <w:rPr>
+          <w:rFonts w:ascii="Bahnschrift" w:hAnsi="Bahnschrift"/>
+          <w:sz w:val="28"/>
+          <w:szCs w:val="28"/>
+          <w:lang w:val="en-US" w:eastAsia="ru-RU"/>
+        </w:rPr>
+        <w:t>rod_offset</w:t>
+      </w:r>
+      <w:r>
+        <w:rPr>
+          <w:rFonts w:ascii="Bahnschrift" w:hAnsi="Bahnschrift"/>
+          <w:sz w:val="28"/>
+          <w:szCs w:val="28"/>
+          <w:lang w:eastAsia="ru-RU"/>
+        </w:rPr>
+        <w:t xml:space="preserve"> всё равно нужен. </w:t>
       </w:r>
     </w:p>
     <w:p>
@@ -9348,8 +9121,6 @@
         </w:rPr>
         <w:t xml:space="preserve">секцию </w:t>
       </w:r>
-      <w:proofErr w:type="spellStart"/>
-      <w:proofErr w:type="gramStart"/>
       <w:r>
         <w:rPr>
           <w:rFonts w:ascii="Bahnschrift" w:hAnsi="Bahnschrift"/>
@@ -9359,7 +9130,6 @@
         </w:rPr>
         <w:t>memcpy</w:t>
       </w:r>
-      <w:proofErr w:type="spellEnd"/>
       <w:r>
         <w:rPr>
           <w:rFonts w:ascii="Bahnschrift" w:hAnsi="Bahnschrift"/>
@@ -9369,8 +9139,6 @@
         </w:rPr>
         <w:t>(</w:t>
       </w:r>
-      <w:proofErr w:type="spellStart"/>
-      <w:proofErr w:type="gramEnd"/>
       <w:r>
         <w:rPr>
           <w:rFonts w:ascii="Bahnschrift" w:hAnsi="Bahnschrift"/>
@@ -9380,7 +9148,6 @@
         </w:rPr>
         <w:t>dest</w:t>
       </w:r>
-      <w:proofErr w:type="spellEnd"/>
       <w:r>
         <w:rPr>
           <w:rFonts w:ascii="Bahnschrift" w:hAnsi="Bahnschrift"/>
@@ -9390,7 +9157,6 @@
         </w:rPr>
         <w:t>,</w:t>
       </w:r>
-      <w:proofErr w:type="spellStart"/>
       <w:r>
         <w:rPr>
           <w:rFonts w:ascii="Bahnschrift" w:hAnsi="Bahnschrift"/>
@@ -9400,7 +9166,6 @@
         </w:rPr>
         <w:t>src</w:t>
       </w:r>
-      <w:proofErr w:type="spellEnd"/>
       <w:r>
         <w:rPr>
           <w:rFonts w:ascii="Bahnschrift" w:hAnsi="Bahnschrift"/>
@@ -9455,7 +9220,6 @@
         </w:rPr>
         <w:t xml:space="preserve">. Дальше следует загрузить команды с помощью </w:t>
       </w:r>
-      <w:proofErr w:type="spellStart"/>
       <w:r>
         <w:rPr>
           <w:rFonts w:ascii="Bahnschrift" w:hAnsi="Bahnschrift"/>
@@ -9465,7 +9229,6 @@
         </w:rPr>
         <w:t>memcpy</w:t>
       </w:r>
-      <w:proofErr w:type="spellEnd"/>
       <w:r>
         <w:rPr>
           <w:rFonts w:ascii="Bahnschrift" w:hAnsi="Bahnschrift"/>
@@ -9475,8 +9238,6 @@
         </w:rPr>
         <w:t>(</w:t>
       </w:r>
-      <w:proofErr w:type="spellStart"/>
-      <w:proofErr w:type="gramStart"/>
       <w:r>
         <w:rPr>
           <w:rFonts w:ascii="Bahnschrift" w:hAnsi="Bahnschrift"/>
@@ -9486,7 +9247,6 @@
         </w:rPr>
         <w:t>dest</w:t>
       </w:r>
-      <w:proofErr w:type="spellEnd"/>
       <w:r>
         <w:rPr>
           <w:rFonts w:ascii="Bahnschrift" w:hAnsi="Bahnschrift"/>
@@ -9496,7 +9256,6 @@
         </w:rPr>
         <w:t>,</w:t>
       </w:r>
-      <w:proofErr w:type="spellStart"/>
       <w:r>
         <w:rPr>
           <w:rFonts w:ascii="Bahnschrift" w:hAnsi="Bahnschrift"/>
@@ -9506,8 +9265,6 @@
         </w:rPr>
         <w:t>src</w:t>
       </w:r>
-      <w:proofErr w:type="spellEnd"/>
-      <w:proofErr w:type="gramEnd"/>
       <w:r>
         <w:rPr>
           <w:rFonts w:ascii="Bahnschrift" w:hAnsi="Bahnschrift"/>
@@ -9569,29 +9326,8 @@
           <w:szCs w:val="28"/>
           <w:lang w:eastAsia="ru-RU"/>
         </w:rPr>
-        <w:t xml:space="preserve"> Почему используется размер? В случае добавления </w:t>
-      </w:r>
-      <w:proofErr w:type="spellStart"/>
-      <w:r>
-        <w:rPr>
-          <w:rFonts w:ascii="Bahnschrift" w:hAnsi="Bahnschrift"/>
-          <w:sz w:val="28"/>
-          <w:szCs w:val="28"/>
-          <w:lang w:eastAsia="ru-RU"/>
-        </w:rPr>
-        <w:t>доп</w:t>
-      </w:r>
-      <w:proofErr w:type="spellEnd"/>
-      <w:r>
-        <w:rPr>
-          <w:rFonts w:ascii="Bahnschrift" w:hAnsi="Bahnschrift"/>
-          <w:sz w:val="28"/>
-          <w:szCs w:val="28"/>
-          <w:lang w:eastAsia="ru-RU"/>
-        </w:rPr>
-        <w:t xml:space="preserve"> секции не пришлось старым </w:t>
-      </w:r>
-      <w:proofErr w:type="spellStart"/>
+        <w:t xml:space="preserve"> Почему используется размер? В случае добавления доп секции не пришлось старым </w:t>
+      </w:r>
       <w:r>
         <w:rPr>
           <w:rFonts w:ascii="Bahnschrift" w:hAnsi="Bahnschrift"/>
@@ -9601,7 +9337,6 @@
         </w:rPr>
         <w:t>vm</w:t>
       </w:r>
-      <w:proofErr w:type="spellEnd"/>
       <w:r>
         <w:rPr>
           <w:rFonts w:ascii="Bahnschrift" w:hAnsi="Bahnschrift"/>

</xml_diff>